<commit_message>
Docs: fix stale folder names in field procedure; add dated re-run section to verification status
</commit_message>
<xml_diff>
--- a/docs/No_Hardware_Verification_Status.docx
+++ b/docs/No_Hardware_Verification_Status.docx
@@ -657,6 +657,620 @@
           <w:szCs w:val="24"/>
         </w:rPr>
         <w:t xml:space="preserve">Not proven, and cannot be from a laptop alone: that any of this works once real electricity meets real silicon. Compiling is not the same as flashing. Simulated data is not real sensor data. That gap can only close with the actual hardware.</w:t>
+      </w:r>
+    </w:p>
+    <w:p>
+      <w:pPr>
+        <w:spacing w:after="200" w:before="300"/>
+      </w:pPr>
+      <w:r>
+        <w:rPr>
+          <w:rFonts w:ascii="Times New Roman" w:cs="Times New Roman" w:eastAsia="Times New Roman" w:hAnsi="Times New Roman"/>
+          <w:b/>
+          <w:bCs/>
+          <w:sz w:val="26"/>
+          <w:szCs w:val="26"/>
+        </w:rPr>
+        <w:t xml:space="preserve">Independent Re-run (13 October 2026)</w:t>
+      </w:r>
+    </w:p>
+    <w:p>
+      <w:pPr>
+        <w:spacing w:after="200" w:line="360"/>
+        <w:jc w:val="both"/>
+      </w:pPr>
+      <w:r>
+        <w:rPr>
+          <w:rFonts w:ascii="Times New Roman" w:cs="Times New Roman" w:eastAsia="Times New Roman" w:hAnsi="Times New Roman"/>
+          <w:sz w:val="24"/>
+          <w:szCs w:val="24"/>
+        </w:rPr>
+        <w:t xml:space="preserve">The checklist above does not record a date, commit or environment. This section records a separate re-run so the two are not confused. Environment: an AI assistant (Claude) on Linux (Ubuntu, Python 3.12.3, g++ 13.3.0) with no hardware attached. Code: branch lockin-start-here, commit 67fd5f2; results apply to that commit only. Every check below uses synthetic data or pure code logic, and none involves real gloves, a receiver or a Raspberry Pi.</w:t>
+      </w:r>
+    </w:p>
+    <w:tbl>
+      <w:tblPr>
+        <w:tblW w:type="dxa" w:w="8600"/>
+        <w:tblBorders>
+          <w:top w:val="single" w:color="auto" w:sz="4"/>
+          <w:left w:val="single" w:color="auto" w:sz="4"/>
+          <w:bottom w:val="single" w:color="auto" w:sz="4"/>
+          <w:right w:val="single" w:color="auto" w:sz="4"/>
+          <w:insideH w:val="single" w:color="auto" w:sz="4"/>
+          <w:insideV w:val="single" w:color="auto" w:sz="4"/>
+        </w:tblBorders>
+      </w:tblPr>
+      <w:tblGrid>
+        <w:gridCol w:w="2000"/>
+        <w:gridCol w:w="4800"/>
+        <w:gridCol w:w="1800"/>
+      </w:tblGrid>
+      <w:tr>
+        <w:tc>
+          <w:tcPr>
+            <w:tcW w:type="dxa" w:w="2000"/>
+            <w:shd w:fill="D9D9D9" w:val="clear"/>
+            <w:tcMar>
+              <w:top w:type="dxa" w:w="80"/>
+              <w:left w:type="dxa" w:w="100"/>
+              <w:bottom w:type="dxa" w:w="80"/>
+              <w:right w:type="dxa" w:w="100"/>
+            </w:tcMar>
+          </w:tcPr>
+          <w:p>
+            <w:pPr>
+              <w:jc w:val="center"/>
+            </w:pPr>
+            <w:r>
+              <w:rPr>
+                <w:rFonts w:ascii="Times New Roman" w:cs="Times New Roman" w:eastAsia="Times New Roman" w:hAnsi="Times New Roman"/>
+                <w:b/>
+                <w:bCs/>
+                <w:sz w:val="22"/>
+                <w:szCs w:val="22"/>
+              </w:rPr>
+              <w:t xml:space="preserve">Layer</w:t>
+            </w:r>
+          </w:p>
+        </w:tc>
+        <w:tc>
+          <w:tcPr>
+            <w:tcW w:type="dxa" w:w="4800"/>
+            <w:shd w:fill="D9D9D9" w:val="clear"/>
+            <w:tcMar>
+              <w:top w:type="dxa" w:w="80"/>
+              <w:left w:type="dxa" w:w="100"/>
+              <w:bottom w:type="dxa" w:w="80"/>
+              <w:right w:type="dxa" w:w="100"/>
+            </w:tcMar>
+          </w:tcPr>
+          <w:p>
+            <w:pPr>
+              <w:jc w:val="center"/>
+            </w:pPr>
+            <w:r>
+              <w:rPr>
+                <w:rFonts w:ascii="Times New Roman" w:cs="Times New Roman" w:eastAsia="Times New Roman" w:hAnsi="Times New Roman"/>
+                <w:b/>
+                <w:bCs/>
+                <w:sz w:val="22"/>
+                <w:szCs w:val="22"/>
+              </w:rPr>
+              <w:t xml:space="preserve">Check</w:t>
+            </w:r>
+          </w:p>
+        </w:tc>
+        <w:tc>
+          <w:tcPr>
+            <w:tcW w:type="dxa" w:w="1800"/>
+            <w:shd w:fill="D9D9D9" w:val="clear"/>
+            <w:tcMar>
+              <w:top w:type="dxa" w:w="80"/>
+              <w:left w:type="dxa" w:w="100"/>
+              <w:bottom w:type="dxa" w:w="80"/>
+              <w:right w:type="dxa" w:w="100"/>
+            </w:tcMar>
+          </w:tcPr>
+          <w:p>
+            <w:pPr>
+              <w:jc w:val="center"/>
+            </w:pPr>
+            <w:r>
+              <w:rPr>
+                <w:rFonts w:ascii="Times New Roman" w:cs="Times New Roman" w:eastAsia="Times New Roman" w:hAnsi="Times New Roman"/>
+                <w:b/>
+                <w:bCs/>
+                <w:sz w:val="22"/>
+                <w:szCs w:val="22"/>
+              </w:rPr>
+              <w:t xml:space="preserve">Status</w:t>
+            </w:r>
+          </w:p>
+        </w:tc>
+      </w:tr>
+      <w:tr>
+        <w:tc>
+          <w:tcPr>
+            <w:tcW w:type="dxa" w:w="2000"/>
+            <w:tcMar>
+              <w:top w:type="dxa" w:w="80"/>
+              <w:left w:type="dxa" w:w="100"/>
+              <w:bottom w:type="dxa" w:w="80"/>
+              <w:right w:type="dxa" w:w="100"/>
+            </w:tcMar>
+          </w:tcPr>
+          <w:p>
+            <w:r>
+              <w:rPr>
+                <w:rFonts w:ascii="Times New Roman" w:cs="Times New Roman" w:eastAsia="Times New Roman" w:hAnsi="Times New Roman"/>
+                <w:b w:val="false"/>
+                <w:bCs w:val="false"/>
+                <w:sz w:val="22"/>
+                <w:szCs w:val="22"/>
+              </w:rPr>
+              <w:t xml:space="preserve">Pi-side app</w:t>
+            </w:r>
+          </w:p>
+        </w:tc>
+        <w:tc>
+          <w:tcPr>
+            <w:tcW w:type="dxa" w:w="4800"/>
+            <w:tcMar>
+              <w:top w:type="dxa" w:w="80"/>
+              <w:left w:type="dxa" w:w="100"/>
+              <w:bottom w:type="dxa" w:w="80"/>
+              <w:right w:type="dxa" w:w="100"/>
+            </w:tcMar>
+          </w:tcPr>
+          <w:p>
+            <w:r>
+              <w:rPr>
+                <w:rFonts w:ascii="Times New Roman" w:cs="Times New Roman" w:eastAsia="Times New Roman" w:hAnsi="Times New Roman"/>
+                <w:b w:val="false"/>
+                <w:bCs w:val="false"/>
+                <w:sz w:val="22"/>
+                <w:szCs w:val="22"/>
+              </w:rPr>
+              <w:t xml:space="preserve">Frame round-trip test, including the serial reader resync check</w:t>
+            </w:r>
+          </w:p>
+        </w:tc>
+        <w:tc>
+          <w:tcPr>
+            <w:tcW w:type="dxa" w:w="1800"/>
+            <w:tcMar>
+              <w:top w:type="dxa" w:w="80"/>
+              <w:left w:type="dxa" w:w="100"/>
+              <w:bottom w:type="dxa" w:w="80"/>
+              <w:right w:type="dxa" w:w="100"/>
+            </w:tcMar>
+          </w:tcPr>
+          <w:p>
+            <w:pPr>
+              <w:jc w:val="center"/>
+            </w:pPr>
+            <w:r>
+              <w:rPr>
+                <w:rFonts w:ascii="Times New Roman" w:cs="Times New Roman" w:eastAsia="Times New Roman" w:hAnsi="Times New Roman"/>
+                <w:b w:val="false"/>
+                <w:bCs w:val="false"/>
+                <w:sz w:val="22"/>
+                <w:szCs w:val="22"/>
+              </w:rPr>
+              <w:t xml:space="preserve">PASS</w:t>
+            </w:r>
+          </w:p>
+        </w:tc>
+      </w:tr>
+      <w:tr>
+        <w:tc>
+          <w:tcPr>
+            <w:tcW w:type="dxa" w:w="2000"/>
+            <w:tcMar>
+              <w:top w:type="dxa" w:w="80"/>
+              <w:left w:type="dxa" w:w="100"/>
+              <w:bottom w:type="dxa" w:w="80"/>
+              <w:right w:type="dxa" w:w="100"/>
+            </w:tcMar>
+          </w:tcPr>
+          <w:p>
+            <w:r>
+              <w:rPr>
+                <w:rFonts w:ascii="Times New Roman" w:cs="Times New Roman" w:eastAsia="Times New Roman" w:hAnsi="Times New Roman"/>
+                <w:b w:val="false"/>
+                <w:bCs w:val="false"/>
+                <w:sz w:val="22"/>
+                <w:szCs w:val="22"/>
+              </w:rPr>
+              <w:t xml:space="preserve">Firmware</w:t>
+            </w:r>
+          </w:p>
+        </w:tc>
+        <w:tc>
+          <w:tcPr>
+            <w:tcW w:type="dxa" w:w="4800"/>
+            <w:tcMar>
+              <w:top w:type="dxa" w:w="80"/>
+              <w:left w:type="dxa" w:w="100"/>
+              <w:bottom w:type="dxa" w:w="80"/>
+              <w:right w:type="dxa" w:w="100"/>
+            </w:tcMar>
+          </w:tcPr>
+          <w:p>
+            <w:r>
+              <w:rPr>
+                <w:rFonts w:ascii="Times New Roman" w:cs="Times New Roman" w:eastAsia="Times New Roman" w:hAnsi="Times New Roman"/>
+                <w:b w:val="false"/>
+                <w:bCs w:val="false"/>
+                <w:sz w:val="22"/>
+                <w:szCs w:val="22"/>
+              </w:rPr>
+              <w:t xml:space="preserve">Native packet.h / frame.h logic tests (g++)</w:t>
+            </w:r>
+          </w:p>
+        </w:tc>
+        <w:tc>
+          <w:tcPr>
+            <w:tcW w:type="dxa" w:w="1800"/>
+            <w:tcMar>
+              <w:top w:type="dxa" w:w="80"/>
+              <w:left w:type="dxa" w:w="100"/>
+              <w:bottom w:type="dxa" w:w="80"/>
+              <w:right w:type="dxa" w:w="100"/>
+            </w:tcMar>
+          </w:tcPr>
+          <w:p>
+            <w:pPr>
+              <w:jc w:val="center"/>
+            </w:pPr>
+            <w:r>
+              <w:rPr>
+                <w:rFonts w:ascii="Times New Roman" w:cs="Times New Roman" w:eastAsia="Times New Roman" w:hAnsi="Times New Roman"/>
+                <w:b w:val="false"/>
+                <w:bCs w:val="false"/>
+                <w:sz w:val="22"/>
+                <w:szCs w:val="22"/>
+              </w:rPr>
+              <w:t xml:space="preserve">PASS</w:t>
+            </w:r>
+          </w:p>
+        </w:tc>
+      </w:tr>
+      <w:tr>
+        <w:tc>
+          <w:tcPr>
+            <w:tcW w:type="dxa" w:w="2000"/>
+            <w:tcMar>
+              <w:top w:type="dxa" w:w="80"/>
+              <w:left w:type="dxa" w:w="100"/>
+              <w:bottom w:type="dxa" w:w="80"/>
+              <w:right w:type="dxa" w:w="100"/>
+            </w:tcMar>
+          </w:tcPr>
+          <w:p>
+            <w:r>
+              <w:rPr>
+                <w:rFonts w:ascii="Times New Roman" w:cs="Times New Roman" w:eastAsia="Times New Roman" w:hAnsi="Times New Roman"/>
+                <w:b w:val="false"/>
+                <w:bCs w:val="false"/>
+                <w:sz w:val="22"/>
+                <w:szCs w:val="22"/>
+              </w:rPr>
+              <w:t xml:space="preserve">Pi-side app</w:t>
+            </w:r>
+          </w:p>
+        </w:tc>
+        <w:tc>
+          <w:tcPr>
+            <w:tcW w:type="dxa" w:w="4800"/>
+            <w:tcMar>
+              <w:top w:type="dxa" w:w="80"/>
+              <w:left w:type="dxa" w:w="100"/>
+              <w:bottom w:type="dxa" w:w="80"/>
+              <w:right w:type="dxa" w:w="100"/>
+            </w:tcMar>
+          </w:tcPr>
+          <w:p>
+            <w:r>
+              <w:rPr>
+                <w:rFonts w:ascii="Times New Roman" w:cs="Times New Roman" w:eastAsia="Times New Roman" w:hAnsi="Times New Roman"/>
+                <w:b w:val="false"/>
+                <w:bCs w:val="false"/>
+                <w:sz w:val="22"/>
+                <w:szCs w:val="22"/>
+              </w:rPr>
+              <w:t xml:space="preserve">Full pipeline (--simulate), run until stopped after 4 seconds</w:t>
+            </w:r>
+          </w:p>
+        </w:tc>
+        <w:tc>
+          <w:tcPr>
+            <w:tcW w:type="dxa" w:w="1800"/>
+            <w:tcMar>
+              <w:top w:type="dxa" w:w="80"/>
+              <w:left w:type="dxa" w:w="100"/>
+              <w:bottom w:type="dxa" w:w="80"/>
+              <w:right w:type="dxa" w:w="100"/>
+            </w:tcMar>
+          </w:tcPr>
+          <w:p>
+            <w:pPr>
+              <w:jc w:val="center"/>
+            </w:pPr>
+            <w:r>
+              <w:rPr>
+                <w:rFonts w:ascii="Times New Roman" w:cs="Times New Roman" w:eastAsia="Times New Roman" w:hAnsi="Times New Roman"/>
+                <w:b w:val="false"/>
+                <w:bCs w:val="false"/>
+                <w:sz w:val="22"/>
+                <w:szCs w:val="22"/>
+              </w:rPr>
+              <w:t xml:space="preserve">Ran, no errors</w:t>
+            </w:r>
+          </w:p>
+        </w:tc>
+      </w:tr>
+      <w:tr>
+        <w:tc>
+          <w:tcPr>
+            <w:tcW w:type="dxa" w:w="2000"/>
+            <w:tcMar>
+              <w:top w:type="dxa" w:w="80"/>
+              <w:left w:type="dxa" w:w="100"/>
+              <w:bottom w:type="dxa" w:w="80"/>
+              <w:right w:type="dxa" w:w="100"/>
+            </w:tcMar>
+          </w:tcPr>
+          <w:p>
+            <w:r>
+              <w:rPr>
+                <w:rFonts w:ascii="Times New Roman" w:cs="Times New Roman" w:eastAsia="Times New Roman" w:hAnsi="Times New Roman"/>
+                <w:b w:val="false"/>
+                <w:bCs w:val="false"/>
+                <w:sz w:val="22"/>
+                <w:szCs w:val="22"/>
+              </w:rPr>
+              <w:t xml:space="preserve">Pi-side app</w:t>
+            </w:r>
+          </w:p>
+        </w:tc>
+        <w:tc>
+          <w:tcPr>
+            <w:tcW w:type="dxa" w:w="4800"/>
+            <w:tcMar>
+              <w:top w:type="dxa" w:w="80"/>
+              <w:left w:type="dxa" w:w="100"/>
+              <w:bottom w:type="dxa" w:w="80"/>
+              <w:right w:type="dxa" w:w="100"/>
+            </w:tcMar>
+          </w:tcPr>
+          <w:p>
+            <w:r>
+              <w:rPr>
+                <w:rFonts w:ascii="Times New Roman" w:cs="Times New Roman" w:eastAsia="Times New Roman" w:hAnsi="Times New Roman"/>
+                <w:b w:val="false"/>
+                <w:bCs w:val="false"/>
+                <w:sz w:val="22"/>
+                <w:szCs w:val="22"/>
+              </w:rPr>
+              <w:t xml:space="preserve">Live viewer (live_view.py --simulate)</w:t>
+            </w:r>
+          </w:p>
+        </w:tc>
+        <w:tc>
+          <w:tcPr>
+            <w:tcW w:type="dxa" w:w="1800"/>
+            <w:tcMar>
+              <w:top w:type="dxa" w:w="80"/>
+              <w:left w:type="dxa" w:w="100"/>
+              <w:bottom w:type="dxa" w:w="80"/>
+              <w:right w:type="dxa" w:w="100"/>
+            </w:tcMar>
+          </w:tcPr>
+          <w:p>
+            <w:pPr>
+              <w:jc w:val="center"/>
+            </w:pPr>
+            <w:r>
+              <w:rPr>
+                <w:rFonts w:ascii="Times New Roman" w:cs="Times New Roman" w:eastAsia="Times New Roman" w:hAnsi="Times New Roman"/>
+                <w:b w:val="false"/>
+                <w:bCs w:val="false"/>
+                <w:sz w:val="22"/>
+                <w:szCs w:val="22"/>
+              </w:rPr>
+              <w:t xml:space="preserve">Ran, no errors</w:t>
+            </w:r>
+          </w:p>
+        </w:tc>
+      </w:tr>
+      <w:tr>
+        <w:tc>
+          <w:tcPr>
+            <w:tcW w:type="dxa" w:w="2000"/>
+            <w:tcMar>
+              <w:top w:type="dxa" w:w="80"/>
+              <w:left w:type="dxa" w:w="100"/>
+              <w:bottom w:type="dxa" w:w="80"/>
+              <w:right w:type="dxa" w:w="100"/>
+            </w:tcMar>
+          </w:tcPr>
+          <w:p>
+            <w:r>
+              <w:rPr>
+                <w:rFonts w:ascii="Times New Roman" w:cs="Times New Roman" w:eastAsia="Times New Roman" w:hAnsi="Times New Roman"/>
+                <w:b w:val="false"/>
+                <w:bCs w:val="false"/>
+                <w:sz w:val="22"/>
+                <w:szCs w:val="22"/>
+              </w:rPr>
+              <w:t xml:space="preserve">Whole repo</w:t>
+            </w:r>
+          </w:p>
+        </w:tc>
+        <w:tc>
+          <w:tcPr>
+            <w:tcW w:type="dxa" w:w="4800"/>
+            <w:tcMar>
+              <w:top w:type="dxa" w:w="80"/>
+              <w:left w:type="dxa" w:w="100"/>
+              <w:bottom w:type="dxa" w:w="80"/>
+              <w:right w:type="dxa" w:w="100"/>
+            </w:tcMar>
+          </w:tcPr>
+          <w:p>
+            <w:r>
+              <w:rPr>
+                <w:rFonts w:ascii="Times New Roman" w:cs="Times New Roman" w:eastAsia="Times New Roman" w:hAnsi="Times New Roman"/>
+                <w:b w:val="false"/>
+                <w:bCs w:val="false"/>
+                <w:sz w:val="22"/>
+                <w:szCs w:val="22"/>
+              </w:rPr>
+              <w:t xml:space="preserve">Python compile check (pi-side, training, tools)</w:t>
+            </w:r>
+          </w:p>
+        </w:tc>
+        <w:tc>
+          <w:tcPr>
+            <w:tcW w:type="dxa" w:w="1800"/>
+            <w:tcMar>
+              <w:top w:type="dxa" w:w="80"/>
+              <w:left w:type="dxa" w:w="100"/>
+              <w:bottom w:type="dxa" w:w="80"/>
+              <w:right w:type="dxa" w:w="100"/>
+            </w:tcMar>
+          </w:tcPr>
+          <w:p>
+            <w:pPr>
+              <w:jc w:val="center"/>
+            </w:pPr>
+            <w:r>
+              <w:rPr>
+                <w:rFonts w:ascii="Times New Roman" w:cs="Times New Roman" w:eastAsia="Times New Roman" w:hAnsi="Times New Roman"/>
+                <w:b w:val="false"/>
+                <w:bCs w:val="false"/>
+                <w:sz w:val="22"/>
+                <w:szCs w:val="22"/>
+              </w:rPr>
+              <w:t xml:space="preserve">PASS</w:t>
+            </w:r>
+          </w:p>
+        </w:tc>
+      </w:tr>
+    </w:tbl>
+    <w:p>
+      <w:pPr>
+        <w:spacing w:after="120"/>
+      </w:pPr>
+    </w:p>
+    <w:p>
+      <w:pPr>
+        <w:spacing w:after="200" w:line="360"/>
+        <w:jc w:val="both"/>
+      </w:pPr>
+      <w:r>
+        <w:rPr>
+          <w:rFonts w:ascii="Times New Roman" w:cs="Times New Roman" w:eastAsia="Times New Roman" w:hAnsi="Times New Roman"/>
+          <w:sz w:val="24"/>
+          <w:szCs w:val="24"/>
+        </w:rPr>
+        <w:t xml:space="preserve">Not run in this re-check:</w:t>
+      </w:r>
+    </w:p>
+    <w:p>
+      <w:pPr>
+        <w:pStyle w:val="ListParagraph"/>
+        <w:numPr>
+          <w:ilvl w:val="0"/>
+          <w:numId w:val="1"/>
+        </w:numPr>
+        <w:spacing w:after="100" w:line="360"/>
+        <w:jc w:val="both"/>
+      </w:pPr>
+      <w:r>
+        <w:rPr>
+          <w:rFonts w:ascii="Times New Roman" w:cs="Times New Roman" w:eastAsia="Times New Roman" w:hAnsi="Times New Roman"/>
+          <w:sz w:val="24"/>
+          <w:szCs w:val="24"/>
+        </w:rPr>
+        <w:t xml:space="preserve">Firmware compilation: not re-run on this commit. An earlier attempt in this environment could not download the ESP32 toolchain.</w:t>
+      </w:r>
+    </w:p>
+    <w:p>
+      <w:pPr>
+        <w:pStyle w:val="ListParagraph"/>
+        <w:numPr>
+          <w:ilvl w:val="0"/>
+          <w:numId w:val="1"/>
+        </w:numPr>
+        <w:spacing w:after="100" w:line="360"/>
+        <w:jc w:val="both"/>
+      </w:pPr>
+      <w:r>
+        <w:rPr>
+          <w:rFonts w:ascii="Times New Roman" w:cs="Times New Roman" w:eastAsia="Times New Roman" w:hAnsi="Times New Roman"/>
+          <w:sz w:val="24"/>
+          <w:szCs w:val="24"/>
+        </w:rPr>
+        <w:t xml:space="preserve">Anything involving real gloves, the receiver or the Raspberry Pi.</w:t>
+      </w:r>
+    </w:p>
+    <w:p>
+      <w:pPr>
+        <w:pStyle w:val="ListParagraph"/>
+        <w:numPr>
+          <w:ilvl w:val="0"/>
+          <w:numId w:val="1"/>
+        </w:numPr>
+        <w:spacing w:after="100" w:line="360"/>
+        <w:jc w:val="both"/>
+      </w:pPr>
+      <w:r>
+        <w:rPr>
+          <w:rFonts w:ascii="Times New Roman" w:cs="Times New Roman" w:eastAsia="Times New Roman" w:hAnsi="Times New Roman"/>
+          <w:sz w:val="24"/>
+          <w:szCs w:val="24"/>
+        </w:rPr>
+        <w:t xml:space="preserve">Windows and PowerShell behavior, and the test dashboard window.</w:t>
+      </w:r>
+    </w:p>
+    <w:p>
+      <w:pPr>
+        <w:pStyle w:val="ListParagraph"/>
+        <w:numPr>
+          <w:ilvl w:val="0"/>
+          <w:numId w:val="1"/>
+        </w:numPr>
+        <w:spacing w:after="100" w:line="360"/>
+        <w:jc w:val="both"/>
+      </w:pPr>
+      <w:r>
+        <w:rPr>
+          <w:rFonts w:ascii="Times New Roman" w:cs="Times New Roman" w:eastAsia="Times New Roman" w:hAnsi="Times New Roman"/>
+          <w:sz w:val="24"/>
+          <w:szCs w:val="24"/>
+        </w:rPr>
+        <w:t xml:space="preserve">Text-to-speech audio output, and model training.</w:t>
+      </w:r>
+    </w:p>
+    <w:p>
+      <w:pPr>
+        <w:pStyle w:val="ListParagraph"/>
+        <w:numPr>
+          <w:ilvl w:val="0"/>
+          <w:numId w:val="1"/>
+        </w:numPr>
+        <w:spacing w:after="100" w:line="360"/>
+        <w:jc w:val="both"/>
+      </w:pPr>
+      <w:r>
+        <w:rPr>
+          <w:rFonts w:ascii="Times New Roman" w:cs="Times New Roman" w:eastAsia="Times New Roman" w:hAnsi="Times New Roman"/>
+          <w:sz w:val="24"/>
+          <w:szCs w:val="24"/>
+        </w:rPr>
+        <w:t xml:space="preserve">GitHub Actions (CI) results.</w:t>
       </w:r>
     </w:p>
     <w:p>

</xml_diff>

<commit_message>
Docs: record the 26-27 Oct first hardware session (Pi 5, receiver, right/left glove) and the IO12 finding
Project log: entries for 22-25 Oct and 26-27 Oct. Verification status: new section with the real-hardware results. Glove README: replace the outdated 'board starts normally' note with the boot-loop finding and the IO21/IO22 decision.
</commit_message>
<xml_diff>
--- a/docs/No_Hardware_Verification_Status.docx
+++ b/docs/No_Hardware_Verification_Status.docx
@@ -2088,6 +2088,1200 @@
           <w:szCs w:val="24"/>
         </w:rPr>
         <w:t>Speech from the console app (signyales_hub.main) on Windows.</w:t>
+      </w:r>
+    </w:p>
+    <w:p>
+      <w:pPr>
+        <w:spacing w:after="200" w:before="300"/>
+      </w:pPr>
+      <w:r>
+        <w:rPr>
+          <w:rFonts w:ascii="Times New Roman" w:cs="Times New Roman" w:eastAsia="Times New Roman" w:hAnsi="Times New Roman"/>
+          <w:b/>
+          <w:bCs/>
+          <w:sz w:val="26"/>
+          <w:szCs w:val="26"/>
+        </w:rPr>
+        <w:t>First Hardware Session (26–27 October 2026)</w:t>
+      </w:r>
+    </w:p>
+    <w:p>
+      <w:pPr>
+        <w:spacing w:after="200" w:line="360"/>
+        <w:jc w:val="both"/>
+      </w:pPr>
+      <w:r>
+        <w:rPr>
+          <w:rFonts w:ascii="Times New Roman" w:cs="Times New Roman" w:eastAsia="Times New Roman" w:hAnsi="Times New Roman"/>
+          <w:sz w:val="24"/>
+          <w:szCs w:val="24"/>
+        </w:rPr>
+        <w:t xml:space="preserve">Branch code-tasks, commit be7fa90. This is the first section with real hardware: the Raspberry Pi 5, the receiver and the right glove. The project owner ran the checks; results come from the terminal output and screenshots seen during the session. Rows marked "fake data" still use simulated glove data. No real glove data reached the Pi in this session.</w:t>
+      </w:r>
+    </w:p>
+    <w:tbl>
+      <w:tblPr>
+        <w:tblW w:type="dxa" w:w="8600"/>
+        <w:tblBorders>
+          <w:top w:val="single" w:color="auto" w:sz="4"/>
+          <w:left w:val="single" w:color="auto" w:sz="4"/>
+          <w:bottom w:val="single" w:color="auto" w:sz="4"/>
+          <w:right w:val="single" w:color="auto" w:sz="4"/>
+          <w:insideH w:val="single" w:color="auto" w:sz="4"/>
+          <w:insideV w:val="single" w:color="auto" w:sz="4"/>
+        </w:tblBorders>
+      </w:tblPr>
+      <w:tblGrid>
+        <w:gridCol w:w="2000"/>
+        <w:gridCol w:w="4800"/>
+        <w:gridCol w:w="1800"/>
+      </w:tblGrid>
+      <w:tr>
+        <w:tc>
+          <w:tcPr>
+            <w:tcW w:type="dxa" w:w="2000"/>
+            <w:shd w:fill="D9D9D9" w:val="clear"/>
+            <w:tcMar>
+              <w:top w:type="dxa" w:w="80"/>
+              <w:left w:type="dxa" w:w="100"/>
+              <w:bottom w:type="dxa" w:w="80"/>
+              <w:right w:type="dxa" w:w="100"/>
+            </w:tcMar>
+          </w:tcPr>
+          <w:p>
+            <w:pPr>
+              <w:jc w:val="center"/>
+            </w:pPr>
+            <w:r>
+              <w:rPr>
+                <w:rFonts w:ascii="Times New Roman" w:cs="Times New Roman" w:eastAsia="Times New Roman" w:hAnsi="Times New Roman"/>
+                <w:b/>
+                <w:bCs/>
+                <w:sz w:val="22"/>
+                <w:szCs w:val="22"/>
+              </w:rPr>
+              <w:t>Environment</w:t>
+            </w:r>
+          </w:p>
+        </w:tc>
+        <w:tc>
+          <w:tcPr>
+            <w:tcW w:type="dxa" w:w="4800"/>
+            <w:shd w:fill="D9D9D9" w:val="clear"/>
+            <w:tcMar>
+              <w:top w:type="dxa" w:w="80"/>
+              <w:left w:type="dxa" w:w="100"/>
+              <w:bottom w:type="dxa" w:w="80"/>
+              <w:right w:type="dxa" w:w="100"/>
+            </w:tcMar>
+          </w:tcPr>
+          <w:p>
+            <w:pPr>
+              <w:jc w:val="center"/>
+            </w:pPr>
+            <w:r>
+              <w:rPr>
+                <w:rFonts w:ascii="Times New Roman" w:cs="Times New Roman" w:eastAsia="Times New Roman" w:hAnsi="Times New Roman"/>
+                <w:b/>
+                <w:bCs/>
+                <w:sz w:val="22"/>
+                <w:szCs w:val="22"/>
+              </w:rPr>
+              <w:t>Check</w:t>
+            </w:r>
+          </w:p>
+        </w:tc>
+        <w:tc>
+          <w:tcPr>
+            <w:tcW w:type="dxa" w:w="1800"/>
+            <w:shd w:fill="D9D9D9" w:val="clear"/>
+            <w:tcMar>
+              <w:top w:type="dxa" w:w="80"/>
+              <w:left w:type="dxa" w:w="100"/>
+              <w:bottom w:type="dxa" w:w="80"/>
+              <w:right w:type="dxa" w:w="100"/>
+            </w:tcMar>
+          </w:tcPr>
+          <w:p>
+            <w:pPr>
+              <w:jc w:val="center"/>
+            </w:pPr>
+            <w:r>
+              <w:rPr>
+                <w:rFonts w:ascii="Times New Roman" w:cs="Times New Roman" w:eastAsia="Times New Roman" w:hAnsi="Times New Roman"/>
+                <w:b/>
+                <w:bCs/>
+                <w:sz w:val="22"/>
+                <w:szCs w:val="22"/>
+              </w:rPr>
+              <w:t>Status</w:t>
+            </w:r>
+          </w:p>
+        </w:tc>
+      </w:tr>
+      <w:tr>
+        <w:tc>
+          <w:tcPr>
+            <w:tcW w:type="dxa" w:w="2000"/>
+            <w:tcMar>
+              <w:top w:type="dxa" w:w="80"/>
+              <w:left w:type="dxa" w:w="100"/>
+              <w:bottom w:type="dxa" w:w="80"/>
+              <w:right w:type="dxa" w:w="100"/>
+            </w:tcMar>
+          </w:tcPr>
+          <w:p>
+            <w:r>
+              <w:rPr>
+                <w:rFonts w:ascii="Times New Roman" w:cs="Times New Roman" w:eastAsia="Times New Roman" w:hAnsi="Times New Roman"/>
+                <w:b w:val="false"/>
+                <w:bCs w:val="false"/>
+                <w:sz w:val="22"/>
+                <w:szCs w:val="22"/>
+              </w:rPr>
+              <w:t>Raspberry Pi 5 (Raspberry Pi OS 64-bit, Debian 13, Python 3.13.5)</w:t>
+            </w:r>
+          </w:p>
+        </w:tc>
+        <w:tc>
+          <w:tcPr>
+            <w:tcW w:type="dxa" w:w="4800"/>
+            <w:tcMar>
+              <w:top w:type="dxa" w:w="80"/>
+              <w:left w:type="dxa" w:w="100"/>
+              <w:bottom w:type="dxa" w:w="80"/>
+              <w:right w:type="dxa" w:w="100"/>
+            </w:tcMar>
+          </w:tcPr>
+          <w:p>
+            <w:r>
+              <w:rPr>
+                <w:rFonts w:ascii="Times New Roman" w:cs="Times New Roman" w:eastAsia="Times New Roman" w:hAnsi="Times New Roman"/>
+                <w:b w:val="false"/>
+                <w:bCs w:val="false"/>
+                <w:sz w:val="22"/>
+                <w:szCs w:val="22"/>
+              </w:rPr>
+              <w:t>setup_pi.sh: full package install (TensorFlow 2.21.0, pyserial, numpy, espeak-ng, gpiozero, lgpio) and dtparam=uart0=on added. Run 1 stopped when the Pi lost Wi-Fi; run 2 failed building lgpio (swig missing), fixed by hand with apt install swig liblgpio-dev.</w:t>
+            </w:r>
+          </w:p>
+        </w:tc>
+        <w:tc>
+          <w:tcPr>
+            <w:tcW w:type="dxa" w:w="1800"/>
+            <w:tcMar>
+              <w:top w:type="dxa" w:w="80"/>
+              <w:left w:type="dxa" w:w="100"/>
+              <w:bottom w:type="dxa" w:w="80"/>
+              <w:right w:type="dxa" w:w="100"/>
+            </w:tcMar>
+          </w:tcPr>
+          <w:p>
+            <w:pPr>
+              <w:jc w:val="center"/>
+            </w:pPr>
+            <w:r>
+              <w:rPr>
+                <w:rFonts w:ascii="Times New Roman" w:cs="Times New Roman" w:eastAsia="Times New Roman" w:hAnsi="Times New Roman"/>
+                <w:b w:val="false"/>
+                <w:bCs w:val="false"/>
+                <w:sz w:val="22"/>
+                <w:szCs w:val="22"/>
+              </w:rPr>
+              <w:t>PASS on the third run</w:t>
+            </w:r>
+          </w:p>
+        </w:tc>
+      </w:tr>
+      <w:tr>
+        <w:tc>
+          <w:tcPr>
+            <w:tcW w:type="dxa" w:w="2000"/>
+            <w:tcMar>
+              <w:top w:type="dxa" w:w="80"/>
+              <w:left w:type="dxa" w:w="100"/>
+              <w:bottom w:type="dxa" w:w="80"/>
+              <w:right w:type="dxa" w:w="100"/>
+            </w:tcMar>
+          </w:tcPr>
+          <w:p>
+            <w:r>
+              <w:rPr>
+                <w:rFonts w:ascii="Times New Roman" w:cs="Times New Roman" w:eastAsia="Times New Roman" w:hAnsi="Times New Roman"/>
+                <w:b w:val="false"/>
+                <w:bCs w:val="false"/>
+                <w:sz w:val="22"/>
+                <w:szCs w:val="22"/>
+              </w:rPr>
+              <w:t>Raspberry Pi 5 (fake data)</w:t>
+            </w:r>
+          </w:p>
+        </w:tc>
+        <w:tc>
+          <w:tcPr>
+            <w:tcW w:type="dxa" w:w="4800"/>
+            <w:tcMar>
+              <w:top w:type="dxa" w:w="80"/>
+              <w:left w:type="dxa" w:w="100"/>
+              <w:bottom w:type="dxa" w:w="80"/>
+              <w:right w:type="dxa" w:w="100"/>
+            </w:tcMar>
+          </w:tcPr>
+          <w:p>
+            <w:r>
+              <w:rPr>
+                <w:rFonts w:ascii="Times New Roman" w:cs="Times New Roman" w:eastAsia="Times New Roman" w:hAnsi="Times New Roman"/>
+                <w:b w:val="false"/>
+                <w:bCs w:val="false"/>
+                <w:sz w:val="22"/>
+                <w:szCs w:val="22"/>
+              </w:rPr>
+              <w:t>Frame round-trip test, Pi-side unit tests, GUI core tests</w:t>
+            </w:r>
+          </w:p>
+        </w:tc>
+        <w:tc>
+          <w:tcPr>
+            <w:tcW w:type="dxa" w:w="1800"/>
+            <w:tcMar>
+              <w:top w:type="dxa" w:w="80"/>
+              <w:left w:type="dxa" w:w="100"/>
+              <w:bottom w:type="dxa" w:w="80"/>
+              <w:right w:type="dxa" w:w="100"/>
+            </w:tcMar>
+          </w:tcPr>
+          <w:p>
+            <w:pPr>
+              <w:jc w:val="center"/>
+            </w:pPr>
+            <w:r>
+              <w:rPr>
+                <w:rFonts w:ascii="Times New Roman" w:cs="Times New Roman" w:eastAsia="Times New Roman" w:hAnsi="Times New Roman"/>
+                <w:b w:val="false"/>
+                <w:bCs w:val="false"/>
+                <w:sz w:val="22"/>
+                <w:szCs w:val="22"/>
+              </w:rPr>
+              <w:t>PASS</w:t>
+            </w:r>
+          </w:p>
+        </w:tc>
+      </w:tr>
+      <w:tr>
+        <w:tc>
+          <w:tcPr>
+            <w:tcW w:type="dxa" w:w="2000"/>
+            <w:tcMar>
+              <w:top w:type="dxa" w:w="80"/>
+              <w:left w:type="dxa" w:w="100"/>
+              <w:bottom w:type="dxa" w:w="80"/>
+              <w:right w:type="dxa" w:w="100"/>
+            </w:tcMar>
+          </w:tcPr>
+          <w:p>
+            <w:r>
+              <w:rPr>
+                <w:rFonts w:ascii="Times New Roman" w:cs="Times New Roman" w:eastAsia="Times New Roman" w:hAnsi="Times New Roman"/>
+                <w:b w:val="false"/>
+                <w:bCs w:val="false"/>
+                <w:sz w:val="22"/>
+                <w:szCs w:val="22"/>
+              </w:rPr>
+              <w:t>Raspberry Pi 5 (fake data)</w:t>
+            </w:r>
+          </w:p>
+        </w:tc>
+        <w:tc>
+          <w:tcPr>
+            <w:tcW w:type="dxa" w:w="4800"/>
+            <w:tcMar>
+              <w:top w:type="dxa" w:w="80"/>
+              <w:left w:type="dxa" w:w="100"/>
+              <w:bottom w:type="dxa" w:w="80"/>
+              <w:right w:type="dxa" w:w="100"/>
+            </w:tcMar>
+          </w:tcPr>
+          <w:p>
+            <w:r>
+              <w:rPr>
+                <w:rFonts w:ascii="Times New Roman" w:cs="Times New Roman" w:eastAsia="Times New Roman" w:hAnsi="Times New Roman"/>
+                <w:b w:val="false"/>
+                <w:bCs w:val="false"/>
+                <w:sz w:val="22"/>
+                <w:szCs w:val="22"/>
+              </w:rPr>
+              <w:t>live_view.py --simulate: about 49.4 Hz, both hands, 6 sensors</w:t>
+            </w:r>
+          </w:p>
+        </w:tc>
+        <w:tc>
+          <w:tcPr>
+            <w:tcW w:type="dxa" w:w="1800"/>
+            <w:tcMar>
+              <w:top w:type="dxa" w:w="80"/>
+              <w:left w:type="dxa" w:w="100"/>
+              <w:bottom w:type="dxa" w:w="80"/>
+              <w:right w:type="dxa" w:w="100"/>
+            </w:tcMar>
+          </w:tcPr>
+          <w:p>
+            <w:pPr>
+              <w:jc w:val="center"/>
+            </w:pPr>
+            <w:r>
+              <w:rPr>
+                <w:rFonts w:ascii="Times New Roman" w:cs="Times New Roman" w:eastAsia="Times New Roman" w:hAnsi="Times New Roman"/>
+                <w:b w:val="false"/>
+                <w:bCs w:val="false"/>
+                <w:sz w:val="22"/>
+                <w:szCs w:val="22"/>
+              </w:rPr>
+              <w:t>PASS</w:t>
+            </w:r>
+          </w:p>
+        </w:tc>
+      </w:tr>
+      <w:tr>
+        <w:tc>
+          <w:tcPr>
+            <w:tcW w:type="dxa" w:w="2000"/>
+            <w:tcMar>
+              <w:top w:type="dxa" w:w="80"/>
+              <w:left w:type="dxa" w:w="100"/>
+              <w:bottom w:type="dxa" w:w="80"/>
+              <w:right w:type="dxa" w:w="100"/>
+            </w:tcMar>
+          </w:tcPr>
+          <w:p>
+            <w:r>
+              <w:rPr>
+                <w:rFonts w:ascii="Times New Roman" w:cs="Times New Roman" w:eastAsia="Times New Roman" w:hAnsi="Times New Roman"/>
+                <w:b w:val="false"/>
+                <w:bCs w:val="false"/>
+                <w:sz w:val="22"/>
+                <w:szCs w:val="22"/>
+              </w:rPr>
+              <w:t>Raspberry Pi 5 (fake data)</w:t>
+            </w:r>
+          </w:p>
+        </w:tc>
+        <w:tc>
+          <w:tcPr>
+            <w:tcW w:type="dxa" w:w="4800"/>
+            <w:tcMar>
+              <w:top w:type="dxa" w:w="80"/>
+              <w:left w:type="dxa" w:w="100"/>
+              <w:bottom w:type="dxa" w:w="80"/>
+              <w:right w:type="dxa" w:w="100"/>
+            </w:tcMar>
+          </w:tcPr>
+          <w:p>
+            <w:r>
+              <w:rPr>
+                <w:rFonts w:ascii="Times New Roman" w:cs="Times New Roman" w:eastAsia="Times New Roman" w:hAnsi="Times New Roman"/>
+                <w:b w:val="false"/>
+                <w:bCs w:val="false"/>
+                <w:sz w:val="22"/>
+                <w:szCs w:val="22"/>
+              </w:rPr>
+              <w:t>signyales_hub.main --simulate --no-tts (no model loaded)</w:t>
+            </w:r>
+          </w:p>
+        </w:tc>
+        <w:tc>
+          <w:tcPr>
+            <w:tcW w:type="dxa" w:w="1800"/>
+            <w:tcMar>
+              <w:top w:type="dxa" w:w="80"/>
+              <w:left w:type="dxa" w:w="100"/>
+              <w:bottom w:type="dxa" w:w="80"/>
+              <w:right w:type="dxa" w:w="100"/>
+            </w:tcMar>
+          </w:tcPr>
+          <w:p>
+            <w:pPr>
+              <w:jc w:val="center"/>
+            </w:pPr>
+            <w:r>
+              <w:rPr>
+                <w:rFonts w:ascii="Times New Roman" w:cs="Times New Roman" w:eastAsia="Times New Roman" w:hAnsi="Times New Roman"/>
+                <w:b w:val="false"/>
+                <w:bCs w:val="false"/>
+                <w:sz w:val="22"/>
+                <w:szCs w:val="22"/>
+              </w:rPr>
+              <w:t>Ran, no errors</w:t>
+            </w:r>
+          </w:p>
+        </w:tc>
+      </w:tr>
+      <w:tr>
+        <w:tc>
+          <w:tcPr>
+            <w:tcW w:type="dxa" w:w="2000"/>
+            <w:tcMar>
+              <w:top w:type="dxa" w:w="80"/>
+              <w:left w:type="dxa" w:w="100"/>
+              <w:bottom w:type="dxa" w:w="80"/>
+              <w:right w:type="dxa" w:w="100"/>
+            </w:tcMar>
+          </w:tcPr>
+          <w:p>
+            <w:r>
+              <w:rPr>
+                <w:rFonts w:ascii="Times New Roman" w:cs="Times New Roman" w:eastAsia="Times New Roman" w:hAnsi="Times New Roman"/>
+                <w:b w:val="false"/>
+                <w:bCs w:val="false"/>
+                <w:sz w:val="22"/>
+                <w:szCs w:val="22"/>
+              </w:rPr>
+              <w:t>Raspberry Pi 5</w:t>
+            </w:r>
+          </w:p>
+        </w:tc>
+        <w:tc>
+          <w:tcPr>
+            <w:tcW w:type="dxa" w:w="4800"/>
+            <w:tcMar>
+              <w:top w:type="dxa" w:w="80"/>
+              <w:left w:type="dxa" w:w="100"/>
+              <w:bottom w:type="dxa" w:w="80"/>
+              <w:right w:type="dxa" w:w="100"/>
+            </w:tcMar>
+          </w:tcPr>
+          <w:p>
+            <w:r>
+              <w:rPr>
+                <w:rFonts w:ascii="Times New Roman" w:cs="Times New Roman" w:eastAsia="Times New Roman" w:hAnsi="Times New Roman"/>
+                <w:b w:val="false"/>
+                <w:bCs w:val="false"/>
+                <w:sz w:val="22"/>
+                <w:szCs w:val="22"/>
+              </w:rPr>
+              <w:t>tools/output_check.py: subtitles on screen and speech from the Pi</w:t>
+            </w:r>
+          </w:p>
+        </w:tc>
+        <w:tc>
+          <w:tcPr>
+            <w:tcW w:type="dxa" w:w="1800"/>
+            <w:tcMar>
+              <w:top w:type="dxa" w:w="80"/>
+              <w:left w:type="dxa" w:w="100"/>
+              <w:bottom w:type="dxa" w:w="80"/>
+              <w:right w:type="dxa" w:w="100"/>
+            </w:tcMar>
+          </w:tcPr>
+          <w:p>
+            <w:pPr>
+              <w:jc w:val="center"/>
+            </w:pPr>
+            <w:r>
+              <w:rPr>
+                <w:rFonts w:ascii="Times New Roman" w:cs="Times New Roman" w:eastAsia="Times New Roman" w:hAnsi="Times New Roman"/>
+                <w:b w:val="false"/>
+                <w:bCs w:val="false"/>
+                <w:sz w:val="22"/>
+                <w:szCs w:val="22"/>
+              </w:rPr>
+              <w:t>Seen and heard</w:t>
+            </w:r>
+          </w:p>
+        </w:tc>
+      </w:tr>
+      <w:tr>
+        <w:tc>
+          <w:tcPr>
+            <w:tcW w:type="dxa" w:w="2000"/>
+            <w:tcMar>
+              <w:top w:type="dxa" w:w="80"/>
+              <w:left w:type="dxa" w:w="100"/>
+              <w:bottom w:type="dxa" w:w="80"/>
+              <w:right w:type="dxa" w:w="100"/>
+            </w:tcMar>
+          </w:tcPr>
+          <w:p>
+            <w:r>
+              <w:rPr>
+                <w:rFonts w:ascii="Times New Roman" w:cs="Times New Roman" w:eastAsia="Times New Roman" w:hAnsi="Times New Roman"/>
+                <w:b w:val="false"/>
+                <w:bCs w:val="false"/>
+                <w:sz w:val="22"/>
+                <w:szCs w:val="22"/>
+              </w:rPr>
+              <w:t>Raspberry Pi 5</w:t>
+            </w:r>
+          </w:p>
+        </w:tc>
+        <w:tc>
+          <w:tcPr>
+            <w:tcW w:type="dxa" w:w="4800"/>
+            <w:tcMar>
+              <w:top w:type="dxa" w:w="80"/>
+              <w:left w:type="dxa" w:w="100"/>
+              <w:bottom w:type="dxa" w:w="80"/>
+              <w:right w:type="dxa" w:w="100"/>
+            </w:tcMar>
+          </w:tcPr>
+          <w:p>
+            <w:r>
+              <w:rPr>
+                <w:rFonts w:ascii="Times New Roman" w:cs="Times New Roman" w:eastAsia="Times New Roman" w:hAnsi="Times New Roman"/>
+                <w:b w:val="false"/>
+                <w:bCs w:val="false"/>
+                <w:sz w:val="22"/>
+                <w:szCs w:val="22"/>
+              </w:rPr>
+              <w:t>Serial port in raspi-config: login shell off, hardware on</w:t>
+            </w:r>
+          </w:p>
+        </w:tc>
+        <w:tc>
+          <w:tcPr>
+            <w:tcW w:type="dxa" w:w="1800"/>
+            <w:tcMar>
+              <w:top w:type="dxa" w:w="80"/>
+              <w:left w:type="dxa" w:w="100"/>
+              <w:bottom w:type="dxa" w:w="80"/>
+              <w:right w:type="dxa" w:w="100"/>
+            </w:tcMar>
+          </w:tcPr>
+          <w:p>
+            <w:pPr>
+              <w:jc w:val="center"/>
+            </w:pPr>
+            <w:r>
+              <w:rPr>
+                <w:rFonts w:ascii="Times New Roman" w:cs="Times New Roman" w:eastAsia="Times New Roman" w:hAnsi="Times New Roman"/>
+                <w:b w:val="false"/>
+                <w:bCs w:val="false"/>
+                <w:sz w:val="22"/>
+                <w:szCs w:val="22"/>
+              </w:rPr>
+              <w:t>Done</w:t>
+            </w:r>
+          </w:p>
+        </w:tc>
+      </w:tr>
+      <w:tr>
+        <w:tc>
+          <w:tcPr>
+            <w:tcW w:type="dxa" w:w="2000"/>
+            <w:tcMar>
+              <w:top w:type="dxa" w:w="80"/>
+              <w:left w:type="dxa" w:w="100"/>
+              <w:bottom w:type="dxa" w:w="80"/>
+              <w:right w:type="dxa" w:w="100"/>
+            </w:tcMar>
+          </w:tcPr>
+          <w:p>
+            <w:r>
+              <w:rPr>
+                <w:rFonts w:ascii="Times New Roman" w:cs="Times New Roman" w:eastAsia="Times New Roman" w:hAnsi="Times New Roman"/>
+                <w:b w:val="false"/>
+                <w:bCs w:val="false"/>
+                <w:sz w:val="22"/>
+                <w:szCs w:val="22"/>
+              </w:rPr>
+              <w:t>Raspberry Pi 5 + Windows laptop</w:t>
+            </w:r>
+          </w:p>
+        </w:tc>
+        <w:tc>
+          <w:tcPr>
+            <w:tcW w:type="dxa" w:w="4800"/>
+            <w:tcMar>
+              <w:top w:type="dxa" w:w="80"/>
+              <w:left w:type="dxa" w:w="100"/>
+              <w:bottom w:type="dxa" w:w="80"/>
+              <w:right w:type="dxa" w:w="100"/>
+            </w:tcMar>
+          </w:tcPr>
+          <w:p>
+            <w:r>
+              <w:rPr>
+                <w:rFonts w:ascii="Times New Roman" w:cs="Times New Roman" w:eastAsia="Times New Roman" w:hAnsi="Times New Roman"/>
+                <w:b w:val="false"/>
+                <w:bCs w:val="false"/>
+                <w:sz w:val="22"/>
+                <w:szCs w:val="22"/>
+              </w:rPr>
+              <w:t>SSH and scp from the laptop by IP address (password login)</w:t>
+            </w:r>
+          </w:p>
+        </w:tc>
+        <w:tc>
+          <w:tcPr>
+            <w:tcW w:type="dxa" w:w="1800"/>
+            <w:tcMar>
+              <w:top w:type="dxa" w:w="80"/>
+              <w:left w:type="dxa" w:w="100"/>
+              <w:bottom w:type="dxa" w:w="80"/>
+              <w:right w:type="dxa" w:w="100"/>
+            </w:tcMar>
+          </w:tcPr>
+          <w:p>
+            <w:pPr>
+              <w:jc w:val="center"/>
+            </w:pPr>
+            <w:r>
+              <w:rPr>
+                <w:rFonts w:ascii="Times New Roman" w:cs="Times New Roman" w:eastAsia="Times New Roman" w:hAnsi="Times New Roman"/>
+                <w:b w:val="false"/>
+                <w:bCs w:val="false"/>
+                <w:sz w:val="22"/>
+                <w:szCs w:val="22"/>
+              </w:rPr>
+              <w:t>Works</w:t>
+            </w:r>
+          </w:p>
+        </w:tc>
+      </w:tr>
+      <w:tr>
+        <w:tc>
+          <w:tcPr>
+            <w:tcW w:type="dxa" w:w="2000"/>
+            <w:tcMar>
+              <w:top w:type="dxa" w:w="80"/>
+              <w:left w:type="dxa" w:w="100"/>
+              <w:bottom w:type="dxa" w:w="80"/>
+              <w:right w:type="dxa" w:w="100"/>
+            </w:tcMar>
+          </w:tcPr>
+          <w:p>
+            <w:r>
+              <w:rPr>
+                <w:rFonts w:ascii="Times New Roman" w:cs="Times New Roman" w:eastAsia="Times New Roman" w:hAnsi="Times New Roman"/>
+                <w:b w:val="false"/>
+                <w:bCs w:val="false"/>
+                <w:sz w:val="22"/>
+                <w:szCs w:val="22"/>
+              </w:rPr>
+              <w:t>Receiver (ESP32-WROOM-32, CH340)</w:t>
+            </w:r>
+          </w:p>
+        </w:tc>
+        <w:tc>
+          <w:tcPr>
+            <w:tcW w:type="dxa" w:w="4800"/>
+            <w:tcMar>
+              <w:top w:type="dxa" w:w="80"/>
+              <w:left w:type="dxa" w:w="100"/>
+              <w:bottom w:type="dxa" w:w="80"/>
+              <w:right w:type="dxa" w:w="100"/>
+            </w:tcMar>
+          </w:tcPr>
+          <w:p>
+            <w:r>
+              <w:rPr>
+                <w:rFonts w:ascii="Times New Roman" w:cs="Times New Roman" w:eastAsia="Times New Roman" w:hAnsi="Times New Roman"/>
+                <w:b w:val="false"/>
+                <w:bCs w:val="false"/>
+                <w:sz w:val="22"/>
+                <w:szCs w:val="22"/>
+              </w:rPr>
+              <w:t>Firmware upload from the GUI Hardware helper</w:t>
+            </w:r>
+          </w:p>
+        </w:tc>
+        <w:tc>
+          <w:tcPr>
+            <w:tcW w:type="dxa" w:w="1800"/>
+            <w:tcMar>
+              <w:top w:type="dxa" w:w="80"/>
+              <w:left w:type="dxa" w:w="100"/>
+              <w:bottom w:type="dxa" w:w="80"/>
+              <w:right w:type="dxa" w:w="100"/>
+            </w:tcMar>
+          </w:tcPr>
+          <w:p>
+            <w:pPr>
+              <w:jc w:val="center"/>
+            </w:pPr>
+            <w:r>
+              <w:rPr>
+                <w:rFonts w:ascii="Times New Roman" w:cs="Times New Roman" w:eastAsia="Times New Roman" w:hAnsi="Times New Roman"/>
+                <w:b w:val="false"/>
+                <w:bCs w:val="false"/>
+                <w:sz w:val="22"/>
+                <w:szCs w:val="22"/>
+              </w:rPr>
+              <w:t>PASS</w:t>
+            </w:r>
+          </w:p>
+        </w:tc>
+      </w:tr>
+      <w:tr>
+        <w:tc>
+          <w:tcPr>
+            <w:tcW w:type="dxa" w:w="2000"/>
+            <w:tcMar>
+              <w:top w:type="dxa" w:w="80"/>
+              <w:left w:type="dxa" w:w="100"/>
+              <w:bottom w:type="dxa" w:w="80"/>
+              <w:right w:type="dxa" w:w="100"/>
+            </w:tcMar>
+          </w:tcPr>
+          <w:p>
+            <w:r>
+              <w:rPr>
+                <w:rFonts w:ascii="Times New Roman" w:cs="Times New Roman" w:eastAsia="Times New Roman" w:hAnsi="Times New Roman"/>
+                <w:b w:val="false"/>
+                <w:bCs w:val="false"/>
+                <w:sz w:val="22"/>
+                <w:szCs w:val="22"/>
+              </w:rPr>
+              <w:t>Receiver</w:t>
+            </w:r>
+          </w:p>
+        </w:tc>
+        <w:tc>
+          <w:tcPr>
+            <w:tcW w:type="dxa" w:w="4800"/>
+            <w:tcMar>
+              <w:top w:type="dxa" w:w="80"/>
+              <w:left w:type="dxa" w:w="100"/>
+              <w:bottom w:type="dxa" w:w="80"/>
+              <w:right w:type="dxa" w:w="100"/>
+            </w:tcMar>
+          </w:tcPr>
+          <w:p>
+            <w:r>
+              <w:rPr>
+                <w:rFonts w:ascii="Times New Roman" w:cs="Times New Roman" w:eastAsia="Times New Roman" w:hAnsi="Times New Roman"/>
+                <w:b w:val="false"/>
+                <w:bCs w:val="false"/>
+                <w:sz w:val="22"/>
+                <w:szCs w:val="22"/>
+              </w:rPr>
+              <w:t>Boot: prints its MAC, waits for gloves, [stats] line every second; 0% from both gloves (none were on)</w:t>
+            </w:r>
+          </w:p>
+        </w:tc>
+        <w:tc>
+          <w:tcPr>
+            <w:tcW w:type="dxa" w:w="1800"/>
+            <w:tcMar>
+              <w:top w:type="dxa" w:w="80"/>
+              <w:left w:type="dxa" w:w="100"/>
+              <w:bottom w:type="dxa" w:w="80"/>
+              <w:right w:type="dxa" w:w="100"/>
+            </w:tcMar>
+          </w:tcPr>
+          <w:p>
+            <w:pPr>
+              <w:jc w:val="center"/>
+            </w:pPr>
+            <w:r>
+              <w:rPr>
+                <w:rFonts w:ascii="Times New Roman" w:cs="Times New Roman" w:eastAsia="Times New Roman" w:hAnsi="Times New Roman"/>
+                <w:b w:val="false"/>
+                <w:bCs w:val="false"/>
+                <w:sz w:val="22"/>
+                <w:szCs w:val="22"/>
+              </w:rPr>
+              <w:t>PASS</w:t>
+            </w:r>
+          </w:p>
+        </w:tc>
+      </w:tr>
+      <w:tr>
+        <w:tc>
+          <w:tcPr>
+            <w:tcW w:type="dxa" w:w="2000"/>
+            <w:tcMar>
+              <w:top w:type="dxa" w:w="80"/>
+              <w:left w:type="dxa" w:w="100"/>
+              <w:bottom w:type="dxa" w:w="80"/>
+              <w:right w:type="dxa" w:w="100"/>
+            </w:tcMar>
+          </w:tcPr>
+          <w:p>
+            <w:r>
+              <w:rPr>
+                <w:rFonts w:ascii="Times New Roman" w:cs="Times New Roman" w:eastAsia="Times New Roman" w:hAnsi="Times New Roman"/>
+                <w:b w:val="false"/>
+                <w:bCs w:val="false"/>
+                <w:sz w:val="22"/>
+                <w:szCs w:val="22"/>
+              </w:rPr>
+              <w:t>Right glove (ESP32-DevKitC-32E clone)</w:t>
+            </w:r>
+          </w:p>
+        </w:tc>
+        <w:tc>
+          <w:tcPr>
+            <w:tcW w:type="dxa" w:w="4800"/>
+            <w:tcMar>
+              <w:top w:type="dxa" w:w="80"/>
+              <w:left w:type="dxa" w:w="100"/>
+              <w:bottom w:type="dxa" w:w="80"/>
+              <w:right w:type="dxa" w:w="100"/>
+            </w:tcMar>
+          </w:tcPr>
+          <w:p>
+            <w:r>
+              <w:rPr>
+                <w:rFonts w:ascii="Times New Roman" w:cs="Times New Roman" w:eastAsia="Times New Roman" w:hAnsi="Times New Roman"/>
+                <w:b w:val="false"/>
+                <w:bCs w:val="false"/>
+                <w:sz w:val="22"/>
+                <w:szCs w:val="22"/>
+              </w:rPr>
+              <w:t>Glove firmware upload (right_glove)</w:t>
+            </w:r>
+          </w:p>
+        </w:tc>
+        <w:tc>
+          <w:tcPr>
+            <w:tcW w:type="dxa" w:w="1800"/>
+            <w:tcMar>
+              <w:top w:type="dxa" w:w="80"/>
+              <w:left w:type="dxa" w:w="100"/>
+              <w:bottom w:type="dxa" w:w="80"/>
+              <w:right w:type="dxa" w:w="100"/>
+            </w:tcMar>
+          </w:tcPr>
+          <w:p>
+            <w:pPr>
+              <w:jc w:val="center"/>
+            </w:pPr>
+            <w:r>
+              <w:rPr>
+                <w:rFonts w:ascii="Times New Roman" w:cs="Times New Roman" w:eastAsia="Times New Roman" w:hAnsi="Times New Roman"/>
+                <w:b w:val="false"/>
+                <w:bCs w:val="false"/>
+                <w:sz w:val="22"/>
+                <w:szCs w:val="22"/>
+              </w:rPr>
+              <w:t>PASS</w:t>
+            </w:r>
+          </w:p>
+        </w:tc>
+      </w:tr>
+      <w:tr>
+        <w:tc>
+          <w:tcPr>
+            <w:tcW w:type="dxa" w:w="2000"/>
+            <w:tcMar>
+              <w:top w:type="dxa" w:w="80"/>
+              <w:left w:type="dxa" w:w="100"/>
+              <w:bottom w:type="dxa" w:w="80"/>
+              <w:right w:type="dxa" w:w="100"/>
+            </w:tcMar>
+          </w:tcPr>
+          <w:p>
+            <w:r>
+              <w:rPr>
+                <w:rFonts w:ascii="Times New Roman" w:cs="Times New Roman" w:eastAsia="Times New Roman" w:hAnsi="Times New Roman"/>
+                <w:b w:val="false"/>
+                <w:bCs w:val="false"/>
+                <w:sz w:val="22"/>
+                <w:szCs w:val="22"/>
+              </w:rPr>
+              <w:t>Right glove</w:t>
+            </w:r>
+          </w:p>
+        </w:tc>
+        <w:tc>
+          <w:tcPr>
+            <w:tcW w:type="dxa" w:w="4800"/>
+            <w:tcMar>
+              <w:top w:type="dxa" w:w="80"/>
+              <w:left w:type="dxa" w:w="100"/>
+              <w:bottom w:type="dxa" w:w="80"/>
+              <w:right w:type="dxa" w:w="100"/>
+            </w:tcMar>
+          </w:tcPr>
+          <w:p>
+            <w:r>
+              <w:rPr>
+                <w:rFonts w:ascii="Times New Roman" w:cs="Times New Roman" w:eastAsia="Times New Roman" w:hAnsi="Times New Roman"/>
+                <w:b w:val="false"/>
+                <w:bCs w:val="false"/>
+                <w:sz w:val="22"/>
+                <w:szCs w:val="22"/>
+              </w:rPr>
+              <w:t>Firmware starts after upload</w:t>
+            </w:r>
+          </w:p>
+        </w:tc>
+        <w:tc>
+          <w:tcPr>
+            <w:tcW w:type="dxa" w:w="1800"/>
+            <w:tcMar>
+              <w:top w:type="dxa" w:w="80"/>
+              <w:left w:type="dxa" w:w="100"/>
+              <w:bottom w:type="dxa" w:w="80"/>
+              <w:right w:type="dxa" w:w="100"/>
+            </w:tcMar>
+          </w:tcPr>
+          <w:p>
+            <w:pPr>
+              <w:jc w:val="center"/>
+            </w:pPr>
+            <w:r>
+              <w:rPr>
+                <w:rFonts w:ascii="Times New Roman" w:cs="Times New Roman" w:eastAsia="Times New Roman" w:hAnsi="Times New Roman"/>
+                <w:b w:val="false"/>
+                <w:bCs w:val="false"/>
+                <w:sz w:val="22"/>
+                <w:szCs w:val="22"/>
+              </w:rPr>
+              <w:t>FAIL: boot loop</w:t>
+            </w:r>
+          </w:p>
+        </w:tc>
+      </w:tr>
+      <w:tr>
+        <w:tc>
+          <w:tcPr>
+            <w:tcW w:type="dxa" w:w="2000"/>
+            <w:tcMar>
+              <w:top w:type="dxa" w:w="80"/>
+              <w:left w:type="dxa" w:w="100"/>
+              <w:bottom w:type="dxa" w:w="80"/>
+              <w:right w:type="dxa" w:w="100"/>
+            </w:tcMar>
+          </w:tcPr>
+          <w:p>
+            <w:r>
+              <w:rPr>
+                <w:rFonts w:ascii="Times New Roman" w:cs="Times New Roman" w:eastAsia="Times New Roman" w:hAnsi="Times New Roman"/>
+                <w:b w:val="false"/>
+                <w:bCs w:val="false"/>
+                <w:sz w:val="22"/>
+                <w:szCs w:val="22"/>
+              </w:rPr>
+              <w:t>Left glove</w:t>
+            </w:r>
+          </w:p>
+        </w:tc>
+        <w:tc>
+          <w:tcPr>
+            <w:tcW w:type="dxa" w:w="4800"/>
+            <w:tcMar>
+              <w:top w:type="dxa" w:w="80"/>
+              <w:left w:type="dxa" w:w="100"/>
+              <w:bottom w:type="dxa" w:w="80"/>
+              <w:right w:type="dxa" w:w="100"/>
+            </w:tcMar>
+          </w:tcPr>
+          <w:p>
+            <w:r>
+              <w:rPr>
+                <w:rFonts w:ascii="Times New Roman" w:cs="Times New Roman" w:eastAsia="Times New Roman" w:hAnsi="Times New Roman"/>
+                <w:b w:val="false"/>
+                <w:bCs w:val="false"/>
+                <w:sz w:val="22"/>
+                <w:szCs w:val="22"/>
+              </w:rPr>
+              <w:t>Connects to the laptop over USB</w:t>
+            </w:r>
+          </w:p>
+        </w:tc>
+        <w:tc>
+          <w:tcPr>
+            <w:tcW w:type="dxa" w:w="1800"/>
+            <w:tcMar>
+              <w:top w:type="dxa" w:w="80"/>
+              <w:left w:type="dxa" w:w="100"/>
+              <w:bottom w:type="dxa" w:w="80"/>
+              <w:right w:type="dxa" w:w="100"/>
+            </w:tcMar>
+          </w:tcPr>
+          <w:p>
+            <w:pPr>
+              <w:jc w:val="center"/>
+            </w:pPr>
+            <w:r>
+              <w:rPr>
+                <w:rFonts w:ascii="Times New Roman" w:cs="Times New Roman" w:eastAsia="Times New Roman" w:hAnsi="Times New Roman"/>
+                <w:b w:val="false"/>
+                <w:bCs w:val="false"/>
+                <w:sz w:val="22"/>
+                <w:szCs w:val="22"/>
+              </w:rPr>
+              <w:t>FAIL: not recognised, board gets hot</w:t>
+            </w:r>
+          </w:p>
+        </w:tc>
+      </w:tr>
+    </w:tbl>
+    <w:p>
+      <w:pPr>
+        <w:spacing w:after="200" w:line="360"/>
+        <w:jc w:val="both"/>
+      </w:pPr>
+      <w:r>
+        <w:rPr>
+          <w:rFonts w:ascii="Times New Roman" w:cs="Times New Roman" w:eastAsia="Times New Roman" w:hAnsi="Times New Roman"/>
+          <w:b/>
+          <w:bCs/>
+          <w:sz w:val="24"/>
+          <w:szCs w:val="24"/>
+        </w:rPr>
+        <w:t xml:space="preserve">Right glove boot loop. </w:t>
+      </w:r>
+      <w:r>
+        <w:rPr>
+          <w:rFonts w:ascii="Times New Roman" w:cs="Times New Roman" w:eastAsia="Times New Roman" w:hAnsi="Times New Roman"/>
+          <w:sz w:val="24"/>
+          <w:szCs w:val="24"/>
+        </w:rPr>
+        <w:t xml:space="preserve">The board printed "spi_flash: Detected size(2k) smaller than the size in the binary image header(4096k). Probe failed", then an assert in startup and a software reset, repeating (rst:0xc, boot:0x33). Reasoned cause, not yet confirmed: the motion sensor's SDA line is on IO12, a boot strapping pin. The sensor board's pull-up holds IO12 high at power-on, so the ESP32 sets its flash supply to 1.8 V and the 3.3 V flash cannot be read. Evidence: boot:0x33 on the glove against boot:0x13 on the receiver (the difference is the GPIO12 bit), the flash probe failure, and the sensor board being powered. Decided fix: move the sensor to SDA IO21 and SCL IO22 on both gloves and leave IO12 unconnected. The confirm test (sensor unplugged, board should start) has not been run.</w:t>
+      </w:r>
+    </w:p>
+    <w:p>
+      <w:pPr>
+        <w:spacing w:after="200" w:line="360"/>
+        <w:jc w:val="both"/>
+      </w:pPr>
+      <w:r>
+        <w:rPr>
+          <w:rFonts w:ascii="Times New Roman" w:cs="Times New Roman" w:eastAsia="Times New Roman" w:hAnsi="Times New Roman"/>
+          <w:b/>
+          <w:bCs/>
+          <w:sz w:val="24"/>
+          <w:szCs w:val="24"/>
+        </w:rPr>
+        <w:t xml:space="preserve">Left glove. </w:t>
+      </w:r>
+      <w:r>
+        <w:rPr>
+          <w:rFonts w:ascii="Times New Roman" w:cs="Times New Roman" w:eastAsia="Times New Roman" w:hAnsi="Times New Roman"/>
+          <w:sz w:val="24"/>
+          <w:szCs w:val="24"/>
+        </w:rPr>
+        <w:t xml:space="preserve">Windows showed "Unknown USB Device (Device Descriptor Request Failed)"; once it appeared as a COM port but the upload could not open it. The area around the ESP32's USB port got very hot on USB power alone, with the battery unplugged. The same laptop and cable work with the right glove and the receiver. Reasoned: a short or overcurrent on the board or the PCB. The glove is with the hardware assembler for checks and is not to be powered until then.</w:t>
+      </w:r>
+    </w:p>
+    <w:p>
+      <w:pPr>
+        <w:spacing w:after="200" w:line="360"/>
+        <w:jc w:val="both"/>
+      </w:pPr>
+      <w:r>
+        <w:rPr>
+          <w:rFonts w:ascii="Times New Roman" w:cs="Times New Roman" w:eastAsia="Times New Roman" w:hAnsi="Times New Roman"/>
+          <w:sz w:val="24"/>
+          <w:szCs w:val="24"/>
+        </w:rPr>
+        <w:t xml:space="preserve">Still not run anywhere:</w:t>
+      </w:r>
+    </w:p>
+    <w:p>
+      <w:pPr>
+        <w:pStyle w:val="ListParagraph"/>
+        <w:numPr>
+          <w:ilvl w:val="0"/>
+          <w:numId w:val="1"/>
+        </w:numPr>
+        <w:spacing w:after="100" w:line="360"/>
+        <w:jc w:val="both"/>
+      </w:pPr>
+      <w:r>
+        <w:rPr>
+          <w:rFonts w:ascii="Times New Roman" w:cs="Times New Roman" w:eastAsia="Times New Roman" w:hAnsi="Times New Roman"/>
+          <w:sz w:val="24"/>
+          <w:szCs w:val="24"/>
+        </w:rPr>
+        <w:t>The IO12 confirm test, the glove hardware check and flex calibration on either glove.</w:t>
+      </w:r>
+    </w:p>
+    <w:p>
+      <w:pPr>
+        <w:pStyle w:val="ListParagraph"/>
+        <w:numPr>
+          <w:ilvl w:val="0"/>
+          <w:numId w:val="1"/>
+        </w:numPr>
+        <w:spacing w:after="100" w:line="360"/>
+        <w:jc w:val="both"/>
+      </w:pPr>
+      <w:r>
+        <w:rPr>
+          <w:rFonts w:ascii="Times New Roman" w:cs="Times New Roman" w:eastAsia="Times New Roman" w:hAnsi="Times New Roman"/>
+          <w:sz w:val="24"/>
+          <w:szCs w:val="24"/>
+        </w:rPr>
+        <w:t>The Pi UART loopback test, and the receiver wired to the Pi.</w:t>
+      </w:r>
+    </w:p>
+    <w:p>
+      <w:pPr>
+        <w:pStyle w:val="ListParagraph"/>
+        <w:numPr>
+          <w:ilvl w:val="0"/>
+          <w:numId w:val="1"/>
+        </w:numPr>
+        <w:spacing w:after="100" w:line="360"/>
+        <w:jc w:val="both"/>
+      </w:pPr>
+      <w:r>
+        <w:rPr>
+          <w:rFonts w:ascii="Times New Roman" w:cs="Times New Roman" w:eastAsia="Times New Roman" w:hAnsi="Times New Roman"/>
+          <w:sz w:val="24"/>
+          <w:szCs w:val="24"/>
+        </w:rPr>
+        <w:t>Real glove data on the Pi (receiver stats with gloves on, live_view.py on /dev/ttyAMA0).</w:t>
+      </w:r>
+    </w:p>
+    <w:p>
+      <w:pPr>
+        <w:pStyle w:val="ListParagraph"/>
+        <w:numPr>
+          <w:ilvl w:val="0"/>
+          <w:numId w:val="1"/>
+        </w:numPr>
+        <w:spacing w:after="100" w:line="360"/>
+        <w:jc w:val="both"/>
+      </w:pPr>
+      <w:r>
+        <w:rPr>
+          <w:rFonts w:ascii="Times New Roman" w:cs="Times New Roman" w:eastAsia="Times New Roman" w:hAnsi="Times New Roman"/>
+          <w:sz w:val="24"/>
+          <w:szCs w:val="24"/>
+        </w:rPr>
+        <w:t>Kiosk mode and autostart on the Pi.</w:t>
+      </w:r>
+    </w:p>
+    <w:p>
+      <w:pPr>
+        <w:pStyle w:val="ListParagraph"/>
+        <w:numPr>
+          <w:ilvl w:val="0"/>
+          <w:numId w:val="1"/>
+        </w:numPr>
+        <w:spacing w:after="100" w:line="360"/>
+        <w:jc w:val="both"/>
+      </w:pPr>
+      <w:r>
+        <w:rPr>
+          <w:rFonts w:ascii="Times New Roman" w:cs="Times New Roman" w:eastAsia="Times New Roman" w:hAnsi="Times New Roman"/>
+          <w:sz w:val="24"/>
+          <w:szCs w:val="24"/>
+        </w:rPr>
+        <w:t>Recognition accuracy on real signing, the battery test and the range test.</w:t>
+      </w:r>
+    </w:p>
+    <w:p>
+      <w:pPr>
+        <w:pStyle w:val="ListParagraph"/>
+        <w:numPr>
+          <w:ilvl w:val="0"/>
+          <w:numId w:val="1"/>
+        </w:numPr>
+        <w:spacing w:after="100" w:line="360"/>
+        <w:jc w:val="both"/>
+      </w:pPr>
+      <w:r>
+        <w:rPr>
+          <w:rFonts w:ascii="Times New Roman" w:cs="Times New Roman" w:eastAsia="Times New Roman" w:hAnsi="Times New Roman"/>
+          <w:sz w:val="24"/>
+          <w:szCs w:val="24"/>
+        </w:rPr>
+        <w:t>The mirror over a real network, and console app speech on Windows.</w:t>
       </w:r>
     </w:p>
     <w:p>

</xml_diff>

<commit_message>
Record the 31 Oct receiver link test (USB vs UART) and glove checks; fix live_view summary cut-off
New docs/Signyales_Receiver_Link_Test_2026-10-31.md: setup, commands, USB vs UART results on the real receiver and Pi (gloves off), and the left/right glove hardware-check findings. Project log 31 Oct entry; verification status section. live_view.py: the --duration backup timer only interrupts when no frames arrive and never after the run finished, so the summary is no longer cut off by a KeyboardInterrupt.
</commit_message>
<xml_diff>
--- a/docs/No_Hardware_Verification_Status.docx
+++ b/docs/No_Hardware_Verification_Status.docx
@@ -3282,6 +3282,749 @@
           <w:szCs w:val="24"/>
         </w:rPr>
         <w:t>The mirror over a real network, and console app speech on Windows.</w:t>
+      </w:r>
+    </w:p>
+    <w:p>
+      <w:pPr>
+        <w:spacing w:after="200" w:before="300"/>
+      </w:pPr>
+      <w:r>
+        <w:rPr>
+          <w:rFonts w:ascii="Times New Roman" w:cs="Times New Roman" w:eastAsia="Times New Roman" w:hAnsi="Times New Roman"/>
+          <w:b/>
+          <w:bCs/>
+          <w:sz w:val="26"/>
+          <w:szCs w:val="26"/>
+        </w:rPr>
+        <w:t>Receiver Link Test and Glove Checks (31 October 2026)</w:t>
+      </w:r>
+    </w:p>
+    <w:p>
+      <w:pPr>
+        <w:spacing w:after="200" w:line="360"/>
+        <w:jc w:val="both"/>
+      </w:pPr>
+      <w:r>
+        <w:rPr>
+          <w:rFonts w:ascii="Times New Roman" w:cs="Times New Roman" w:eastAsia="Times New Roman" w:hAnsi="Times New Roman"/>
+          <w:sz w:val="24"/>
+          <w:szCs w:val="24"/>
+        </w:rPr>
+        <w:t xml:space="preserve">Branch code-tasks, commit 51b690f. Real hardware: the receiver on its expansion board, the Raspberry Pi 5 and the laptop, with the gloves switched off for the link tests (they were not ready). The project owner ran the checks; results come from the pasted output. Full numbers, commands and wiring: docs/Signyales_Receiver_Link_Test_2026-10-31.md.</w:t>
+      </w:r>
+    </w:p>
+    <w:tbl>
+      <w:tblPr>
+        <w:tblW w:type="dxa" w:w="8600"/>
+        <w:tblBorders>
+          <w:top w:val="single" w:color="auto" w:sz="4"/>
+          <w:left w:val="single" w:color="auto" w:sz="4"/>
+          <w:bottom w:val="single" w:color="auto" w:sz="4"/>
+          <w:right w:val="single" w:color="auto" w:sz="4"/>
+          <w:insideH w:val="single" w:color="auto" w:sz="4"/>
+          <w:insideV w:val="single" w:color="auto" w:sz="4"/>
+        </w:tblBorders>
+      </w:tblPr>
+      <w:tblGrid>
+        <w:gridCol w:w="2000"/>
+        <w:gridCol w:w="4800"/>
+        <w:gridCol w:w="1800"/>
+      </w:tblGrid>
+      <w:tr>
+        <w:tc>
+          <w:tcPr>
+            <w:tcW w:type="dxa" w:w="2000"/>
+            <w:shd w:fill="D9D9D9" w:val="clear"/>
+            <w:tcMar>
+              <w:top w:type="dxa" w:w="80"/>
+              <w:left w:type="dxa" w:w="100"/>
+              <w:bottom w:type="dxa" w:w="80"/>
+              <w:right w:type="dxa" w:w="100"/>
+            </w:tcMar>
+          </w:tcPr>
+          <w:p>
+            <w:pPr>
+              <w:jc w:val="center"/>
+            </w:pPr>
+            <w:r>
+              <w:rPr>
+                <w:rFonts w:ascii="Times New Roman" w:cs="Times New Roman" w:eastAsia="Times New Roman" w:hAnsi="Times New Roman"/>
+                <w:b/>
+                <w:bCs/>
+                <w:sz w:val="22"/>
+                <w:szCs w:val="22"/>
+              </w:rPr>
+              <w:t>Environment</w:t>
+            </w:r>
+          </w:p>
+        </w:tc>
+        <w:tc>
+          <w:tcPr>
+            <w:tcW w:type="dxa" w:w="4800"/>
+            <w:shd w:fill="D9D9D9" w:val="clear"/>
+            <w:tcMar>
+              <w:top w:type="dxa" w:w="80"/>
+              <w:left w:type="dxa" w:w="100"/>
+              <w:bottom w:type="dxa" w:w="80"/>
+              <w:right w:type="dxa" w:w="100"/>
+            </w:tcMar>
+          </w:tcPr>
+          <w:p>
+            <w:pPr>
+              <w:jc w:val="center"/>
+            </w:pPr>
+            <w:r>
+              <w:rPr>
+                <w:rFonts w:ascii="Times New Roman" w:cs="Times New Roman" w:eastAsia="Times New Roman" w:hAnsi="Times New Roman"/>
+                <w:b/>
+                <w:bCs/>
+                <w:sz w:val="22"/>
+                <w:szCs w:val="22"/>
+              </w:rPr>
+              <w:t>Check</w:t>
+            </w:r>
+          </w:p>
+        </w:tc>
+        <w:tc>
+          <w:tcPr>
+            <w:tcW w:type="dxa" w:w="1800"/>
+            <w:shd w:fill="D9D9D9" w:val="clear"/>
+            <w:tcMar>
+              <w:top w:type="dxa" w:w="80"/>
+              <w:left w:type="dxa" w:w="100"/>
+              <w:bottom w:type="dxa" w:w="80"/>
+              <w:right w:type="dxa" w:w="100"/>
+            </w:tcMar>
+          </w:tcPr>
+          <w:p>
+            <w:pPr>
+              <w:jc w:val="center"/>
+            </w:pPr>
+            <w:r>
+              <w:rPr>
+                <w:rFonts w:ascii="Times New Roman" w:cs="Times New Roman" w:eastAsia="Times New Roman" w:hAnsi="Times New Roman"/>
+                <w:b/>
+                <w:bCs/>
+                <w:sz w:val="22"/>
+                <w:szCs w:val="22"/>
+              </w:rPr>
+              <w:t>Status</w:t>
+            </w:r>
+          </w:p>
+        </w:tc>
+      </w:tr>
+      <w:tr>
+        <w:tc>
+          <w:tcPr>
+            <w:tcW w:type="dxa" w:w="2000"/>
+            <w:tcMar>
+              <w:top w:type="dxa" w:w="80"/>
+              <w:left w:type="dxa" w:w="100"/>
+              <w:bottom w:type="dxa" w:w="80"/>
+              <w:right w:type="dxa" w:w="100"/>
+            </w:tcMar>
+          </w:tcPr>
+          <w:p>
+            <w:r>
+              <w:rPr>
+                <w:rFonts w:ascii="Times New Roman" w:cs="Times New Roman" w:eastAsia="Times New Roman" w:hAnsi="Times New Roman"/>
+                <w:b w:val="false"/>
+                <w:bCs w:val="false"/>
+                <w:sz w:val="22"/>
+                <w:szCs w:val="22"/>
+              </w:rPr>
+              <w:t>Receiver (on expansion board)</w:t>
+            </w:r>
+          </w:p>
+        </w:tc>
+        <w:tc>
+          <w:tcPr>
+            <w:tcW w:type="dxa" w:w="4800"/>
+            <w:tcMar>
+              <w:top w:type="dxa" w:w="80"/>
+              <w:left w:type="dxa" w:w="100"/>
+              <w:bottom w:type="dxa" w:w="80"/>
+              <w:right w:type="dxa" w:w="100"/>
+            </w:tcMar>
+          </w:tcPr>
+          <w:p>
+            <w:r>
+              <w:rPr>
+                <w:rFonts w:ascii="Times New Roman" w:cs="Times New Roman" w:eastAsia="Times New Roman" w:hAnsi="Times New Roman"/>
+                <w:b w:val="false"/>
+                <w:bCs w:val="false"/>
+                <w:sz w:val="22"/>
+                <w:szCs w:val="22"/>
+              </w:rPr>
+              <w:t>Re-flashed with firmware 51b690f: boots (POWERON_RESET), new USB-link line, [stats] advancing 50 frames per second</w:t>
+            </w:r>
+          </w:p>
+        </w:tc>
+        <w:tc>
+          <w:tcPr>
+            <w:tcW w:type="dxa" w:w="1800"/>
+            <w:tcMar>
+              <w:top w:type="dxa" w:w="80"/>
+              <w:left w:type="dxa" w:w="100"/>
+              <w:bottom w:type="dxa" w:w="80"/>
+              <w:right w:type="dxa" w:w="100"/>
+            </w:tcMar>
+          </w:tcPr>
+          <w:p>
+            <w:pPr>
+              <w:jc w:val="center"/>
+            </w:pPr>
+            <w:r>
+              <w:rPr>
+                <w:rFonts w:ascii="Times New Roman" w:cs="Times New Roman" w:eastAsia="Times New Roman" w:hAnsi="Times New Roman"/>
+                <w:b w:val="false"/>
+                <w:bCs w:val="false"/>
+                <w:sz w:val="22"/>
+                <w:szCs w:val="22"/>
+              </w:rPr>
+              <w:t>PASS</w:t>
+            </w:r>
+          </w:p>
+        </w:tc>
+      </w:tr>
+      <w:tr>
+        <w:tc>
+          <w:tcPr>
+            <w:tcW w:type="dxa" w:w="2000"/>
+            <w:tcMar>
+              <w:top w:type="dxa" w:w="80"/>
+              <w:left w:type="dxa" w:w="100"/>
+              <w:bottom w:type="dxa" w:w="80"/>
+              <w:right w:type="dxa" w:w="100"/>
+            </w:tcMar>
+          </w:tcPr>
+          <w:p>
+            <w:r>
+              <w:rPr>
+                <w:rFonts w:ascii="Times New Roman" w:cs="Times New Roman" w:eastAsia="Times New Roman" w:hAnsi="Times New Roman"/>
+                <w:b w:val="false"/>
+                <w:bCs w:val="false"/>
+                <w:sz w:val="22"/>
+                <w:szCs w:val="22"/>
+              </w:rPr>
+              <w:t>Windows laptop + receiver</w:t>
+            </w:r>
+          </w:p>
+        </w:tc>
+        <w:tc>
+          <w:tcPr>
+            <w:tcW w:type="dxa" w:w="4800"/>
+            <w:tcMar>
+              <w:top w:type="dxa" w:w="80"/>
+              <w:left w:type="dxa" w:w="100"/>
+              <w:bottom w:type="dxa" w:w="80"/>
+              <w:right w:type="dxa" w:w="100"/>
+            </w:tcMar>
+          </w:tcPr>
+          <w:p>
+            <w:r>
+              <w:rPr>
+                <w:rFonts w:ascii="Times New Roman" w:cs="Times New Roman" w:eastAsia="Times New Roman" w:hAnsi="Times New Roman"/>
+                <w:b w:val="false"/>
+                <w:bCs w:val="false"/>
+                <w:sz w:val="22"/>
+                <w:szCs w:val="22"/>
+              </w:rPr>
+              <w:t>live_view.py over the USB cable (COM10): 500 frames in 10 s, 49.9 Hz, no restart when the port opened, receiver [stats] received</w:t>
+            </w:r>
+          </w:p>
+        </w:tc>
+        <w:tc>
+          <w:tcPr>
+            <w:tcW w:type="dxa" w:w="1800"/>
+            <w:tcMar>
+              <w:top w:type="dxa" w:w="80"/>
+              <w:left w:type="dxa" w:w="100"/>
+              <w:bottom w:type="dxa" w:w="80"/>
+              <w:right w:type="dxa" w:w="100"/>
+            </w:tcMar>
+          </w:tcPr>
+          <w:p>
+            <w:pPr>
+              <w:jc w:val="center"/>
+            </w:pPr>
+            <w:r>
+              <w:rPr>
+                <w:rFonts w:ascii="Times New Roman" w:cs="Times New Roman" w:eastAsia="Times New Roman" w:hAnsi="Times New Roman"/>
+                <w:b w:val="false"/>
+                <w:bCs w:val="false"/>
+                <w:sz w:val="22"/>
+                <w:szCs w:val="22"/>
+              </w:rPr>
+              <w:t>PASS</w:t>
+            </w:r>
+          </w:p>
+        </w:tc>
+      </w:tr>
+      <w:tr>
+        <w:tc>
+          <w:tcPr>
+            <w:tcW w:type="dxa" w:w="2000"/>
+            <w:tcMar>
+              <w:top w:type="dxa" w:w="80"/>
+              <w:left w:type="dxa" w:w="100"/>
+              <w:bottom w:type="dxa" w:w="80"/>
+              <w:right w:type="dxa" w:w="100"/>
+            </w:tcMar>
+          </w:tcPr>
+          <w:p>
+            <w:r>
+              <w:rPr>
+                <w:rFonts w:ascii="Times New Roman" w:cs="Times New Roman" w:eastAsia="Times New Roman" w:hAnsi="Times New Roman"/>
+                <w:b w:val="false"/>
+                <w:bCs w:val="false"/>
+                <w:sz w:val="22"/>
+                <w:szCs w:val="22"/>
+              </w:rPr>
+              <w:t>Raspberry Pi 5</w:t>
+            </w:r>
+          </w:p>
+        </w:tc>
+        <w:tc>
+          <w:tcPr>
+            <w:tcW w:type="dxa" w:w="4800"/>
+            <w:tcMar>
+              <w:top w:type="dxa" w:w="80"/>
+              <w:left w:type="dxa" w:w="100"/>
+              <w:bottom w:type="dxa" w:w="80"/>
+              <w:right w:type="dxa" w:w="100"/>
+            </w:tcMar>
+          </w:tcPr>
+          <w:p>
+            <w:r>
+              <w:rPr>
+                <w:rFonts w:ascii="Times New Roman" w:cs="Times New Roman" w:eastAsia="Times New Roman" w:hAnsi="Times New Roman"/>
+                <w:b w:val="false"/>
+                <w:bCs w:val="false"/>
+                <w:sz w:val="22"/>
+                <w:szCs w:val="22"/>
+              </w:rPr>
+              <w:t>UART loopback, jumper pin 8 to pin 10, /dev/ttyAMA0</w:t>
+            </w:r>
+          </w:p>
+        </w:tc>
+        <w:tc>
+          <w:tcPr>
+            <w:tcW w:type="dxa" w:w="1800"/>
+            <w:tcMar>
+              <w:top w:type="dxa" w:w="80"/>
+              <w:left w:type="dxa" w:w="100"/>
+              <w:bottom w:type="dxa" w:w="80"/>
+              <w:right w:type="dxa" w:w="100"/>
+            </w:tcMar>
+          </w:tcPr>
+          <w:p>
+            <w:pPr>
+              <w:jc w:val="center"/>
+            </w:pPr>
+            <w:r>
+              <w:rPr>
+                <w:rFonts w:ascii="Times New Roman" w:cs="Times New Roman" w:eastAsia="Times New Roman" w:hAnsi="Times New Roman"/>
+                <w:b w:val="false"/>
+                <w:bCs w:val="false"/>
+                <w:sz w:val="22"/>
+                <w:szCs w:val="22"/>
+              </w:rPr>
+              <w:t>PASS: b'hello'</w:t>
+            </w:r>
+          </w:p>
+        </w:tc>
+      </w:tr>
+      <w:tr>
+        <w:tc>
+          <w:tcPr>
+            <w:tcW w:type="dxa" w:w="2000"/>
+            <w:tcMar>
+              <w:top w:type="dxa" w:w="80"/>
+              <w:left w:type="dxa" w:w="100"/>
+              <w:bottom w:type="dxa" w:w="80"/>
+              <w:right w:type="dxa" w:w="100"/>
+            </w:tcMar>
+          </w:tcPr>
+          <w:p>
+            <w:r>
+              <w:rPr>
+                <w:rFonts w:ascii="Times New Roman" w:cs="Times New Roman" w:eastAsia="Times New Roman" w:hAnsi="Times New Roman"/>
+                <w:b w:val="false"/>
+                <w:bCs w:val="false"/>
+                <w:sz w:val="22"/>
+                <w:szCs w:val="22"/>
+              </w:rPr>
+              <w:t>Raspberry Pi 5 + receiver</w:t>
+            </w:r>
+          </w:p>
+        </w:tc>
+        <w:tc>
+          <w:tcPr>
+            <w:tcW w:type="dxa" w:w="4800"/>
+            <w:tcMar>
+              <w:top w:type="dxa" w:w="80"/>
+              <w:left w:type="dxa" w:w="100"/>
+              <w:bottom w:type="dxa" w:w="80"/>
+              <w:right w:type="dxa" w:w="100"/>
+            </w:tcMar>
+          </w:tcPr>
+          <w:p>
+            <w:r>
+              <w:rPr>
+                <w:rFonts w:ascii="Times New Roman" w:cs="Times New Roman" w:eastAsia="Times New Roman" w:hAnsi="Times New Roman"/>
+                <w:b w:val="false"/>
+                <w:bCs w:val="false"/>
+                <w:sz w:val="22"/>
+                <w:szCs w:val="22"/>
+              </w:rPr>
+              <w:t>live_view.py over the UART wires (/dev/ttyAMA0): 500 frames in 10 s, 49.9 Hz, no gaps</w:t>
+            </w:r>
+          </w:p>
+        </w:tc>
+        <w:tc>
+          <w:tcPr>
+            <w:tcW w:type="dxa" w:w="1800"/>
+            <w:tcMar>
+              <w:top w:type="dxa" w:w="80"/>
+              <w:left w:type="dxa" w:w="100"/>
+              <w:bottom w:type="dxa" w:w="80"/>
+              <w:right w:type="dxa" w:w="100"/>
+            </w:tcMar>
+          </w:tcPr>
+          <w:p>
+            <w:pPr>
+              <w:jc w:val="center"/>
+            </w:pPr>
+            <w:r>
+              <w:rPr>
+                <w:rFonts w:ascii="Times New Roman" w:cs="Times New Roman" w:eastAsia="Times New Roman" w:hAnsi="Times New Roman"/>
+                <w:b w:val="false"/>
+                <w:bCs w:val="false"/>
+                <w:sz w:val="22"/>
+                <w:szCs w:val="22"/>
+              </w:rPr>
+              <w:t>PASS</w:t>
+            </w:r>
+          </w:p>
+        </w:tc>
+      </w:tr>
+      <w:tr>
+        <w:tc>
+          <w:tcPr>
+            <w:tcW w:type="dxa" w:w="2000"/>
+            <w:tcMar>
+              <w:top w:type="dxa" w:w="80"/>
+              <w:left w:type="dxa" w:w="100"/>
+              <w:bottom w:type="dxa" w:w="80"/>
+              <w:right w:type="dxa" w:w="100"/>
+            </w:tcMar>
+          </w:tcPr>
+          <w:p>
+            <w:r>
+              <w:rPr>
+                <w:rFonts w:ascii="Times New Roman" w:cs="Times New Roman" w:eastAsia="Times New Roman" w:hAnsi="Times New Roman"/>
+                <w:b w:val="false"/>
+                <w:bCs w:val="false"/>
+                <w:sz w:val="22"/>
+                <w:szCs w:val="22"/>
+              </w:rPr>
+              <w:t>Raspberry Pi 5 + receiver</w:t>
+            </w:r>
+          </w:p>
+        </w:tc>
+        <w:tc>
+          <w:tcPr>
+            <w:tcW w:type="dxa" w:w="4800"/>
+            <w:tcMar>
+              <w:top w:type="dxa" w:w="80"/>
+              <w:left w:type="dxa" w:w="100"/>
+              <w:bottom w:type="dxa" w:w="80"/>
+              <w:right w:type="dxa" w:w="100"/>
+            </w:tcMar>
+          </w:tcPr>
+          <w:p>
+            <w:r>
+              <w:rPr>
+                <w:rFonts w:ascii="Times New Roman" w:cs="Times New Roman" w:eastAsia="Times New Roman" w:hAnsi="Times New Roman"/>
+                <w:b w:val="false"/>
+                <w:bCs w:val="false"/>
+                <w:sz w:val="22"/>
+                <w:szCs w:val="22"/>
+              </w:rPr>
+              <w:t>live_view.py over the USB cable (/dev/ttyUSB0): receiver restarted once when the port opened (about 1.2 s), then 50 Hz; receiver [stats] received</w:t>
+            </w:r>
+          </w:p>
+        </w:tc>
+        <w:tc>
+          <w:tcPr>
+            <w:tcW w:type="dxa" w:w="1800"/>
+            <w:tcMar>
+              <w:top w:type="dxa" w:w="80"/>
+              <w:left w:type="dxa" w:w="100"/>
+              <w:bottom w:type="dxa" w:w="80"/>
+              <w:right w:type="dxa" w:w="100"/>
+            </w:tcMar>
+          </w:tcPr>
+          <w:p>
+            <w:pPr>
+              <w:jc w:val="center"/>
+            </w:pPr>
+            <w:r>
+              <w:rPr>
+                <w:rFonts w:ascii="Times New Roman" w:cs="Times New Roman" w:eastAsia="Times New Roman" w:hAnsi="Times New Roman"/>
+                <w:b w:val="false"/>
+                <w:bCs w:val="false"/>
+                <w:sz w:val="22"/>
+                <w:szCs w:val="22"/>
+              </w:rPr>
+              <w:t>PASS</w:t>
+            </w:r>
+          </w:p>
+        </w:tc>
+      </w:tr>
+      <w:tr>
+        <w:tc>
+          <w:tcPr>
+            <w:tcW w:type="dxa" w:w="2000"/>
+            <w:tcMar>
+              <w:top w:type="dxa" w:w="80"/>
+              <w:left w:type="dxa" w:w="100"/>
+              <w:bottom w:type="dxa" w:w="80"/>
+              <w:right w:type="dxa" w:w="100"/>
+            </w:tcMar>
+          </w:tcPr>
+          <w:p>
+            <w:r>
+              <w:rPr>
+                <w:rFonts w:ascii="Times New Roman" w:cs="Times New Roman" w:eastAsia="Times New Roman" w:hAnsi="Times New Roman"/>
+                <w:b w:val="false"/>
+                <w:bCs w:val="false"/>
+                <w:sz w:val="22"/>
+                <w:szCs w:val="22"/>
+              </w:rPr>
+              <w:t>Left glove</w:t>
+            </w:r>
+          </w:p>
+        </w:tc>
+        <w:tc>
+          <w:tcPr>
+            <w:tcW w:type="dxa" w:w="4800"/>
+            <w:tcMar>
+              <w:top w:type="dxa" w:w="80"/>
+              <w:left w:type="dxa" w:w="100"/>
+              <w:bottom w:type="dxa" w:w="80"/>
+              <w:right w:type="dxa" w:w="100"/>
+            </w:tcMar>
+          </w:tcPr>
+          <w:p>
+            <w:r>
+              <w:rPr>
+                <w:rFonts w:ascii="Times New Roman" w:cs="Times New Roman" w:eastAsia="Times New Roman" w:hAnsi="Times New Roman"/>
+                <w:b w:val="false"/>
+                <w:bCs w:val="false"/>
+                <w:sz w:val="22"/>
+                <w:szCs w:val="22"/>
+              </w:rPr>
+              <w:t>Uploads and starts; glove firmware stops at "MPU6050 not found"; IMU unpowered; pinky/palm still on IO25/IO26</w:t>
+            </w:r>
+          </w:p>
+        </w:tc>
+        <w:tc>
+          <w:tcPr>
+            <w:tcW w:type="dxa" w:w="1800"/>
+            <w:tcMar>
+              <w:top w:type="dxa" w:w="80"/>
+              <w:left w:type="dxa" w:w="100"/>
+              <w:bottom w:type="dxa" w:w="80"/>
+              <w:right w:type="dxa" w:w="100"/>
+            </w:tcMar>
+          </w:tcPr>
+          <w:p>
+            <w:pPr>
+              <w:jc w:val="center"/>
+            </w:pPr>
+            <w:r>
+              <w:rPr>
+                <w:rFonts w:ascii="Times New Roman" w:cs="Times New Roman" w:eastAsia="Times New Roman" w:hAnsi="Times New Roman"/>
+                <w:b w:val="false"/>
+                <w:bCs w:val="false"/>
+                <w:sz w:val="22"/>
+                <w:szCs w:val="22"/>
+              </w:rPr>
+              <w:t>FAIL: rework not done</w:t>
+            </w:r>
+          </w:p>
+        </w:tc>
+      </w:tr>
+      <w:tr>
+        <w:tc>
+          <w:tcPr>
+            <w:tcW w:type="dxa" w:w="2000"/>
+            <w:tcMar>
+              <w:top w:type="dxa" w:w="80"/>
+              <w:left w:type="dxa" w:w="100"/>
+              <w:bottom w:type="dxa" w:w="80"/>
+              <w:right w:type="dxa" w:w="100"/>
+            </w:tcMar>
+          </w:tcPr>
+          <w:p>
+            <w:r>
+              <w:rPr>
+                <w:rFonts w:ascii="Times New Roman" w:cs="Times New Roman" w:eastAsia="Times New Roman" w:hAnsi="Times New Roman"/>
+                <w:b w:val="false"/>
+                <w:bCs w:val="false"/>
+                <w:sz w:val="22"/>
+                <w:szCs w:val="22"/>
+              </w:rPr>
+              <w:t>Right glove</w:t>
+            </w:r>
+          </w:p>
+        </w:tc>
+        <w:tc>
+          <w:tcPr>
+            <w:tcW w:type="dxa" w:w="4800"/>
+            <w:tcMar>
+              <w:top w:type="dxa" w:w="80"/>
+              <w:left w:type="dxa" w:w="100"/>
+              <w:bottom w:type="dxa" w:w="80"/>
+              <w:right w:type="dxa" w:w="100"/>
+            </w:tcMar>
+          </w:tcPr>
+          <w:p>
+            <w:r>
+              <w:rPr>
+                <w:rFonts w:ascii="Times New Roman" w:cs="Times New Roman" w:eastAsia="Times New Roman" w:hAnsi="Times New Roman"/>
+                <w:b w:val="false"/>
+                <w:bCs w:val="false"/>
+                <w:sz w:val="22"/>
+                <w:szCs w:val="22"/>
+              </w:rPr>
+              <w:t>Starts without the IMU; brownout resets with the IMU connected; later stopped answering uploads</w:t>
+            </w:r>
+          </w:p>
+        </w:tc>
+        <w:tc>
+          <w:tcPr>
+            <w:tcW w:type="dxa" w:w="1800"/>
+            <w:tcMar>
+              <w:top w:type="dxa" w:w="80"/>
+              <w:left w:type="dxa" w:w="100"/>
+              <w:bottom w:type="dxa" w:w="80"/>
+              <w:right w:type="dxa" w:w="100"/>
+            </w:tcMar>
+          </w:tcPr>
+          <w:p>
+            <w:pPr>
+              <w:jc w:val="center"/>
+            </w:pPr>
+            <w:r>
+              <w:rPr>
+                <w:rFonts w:ascii="Times New Roman" w:cs="Times New Roman" w:eastAsia="Times New Roman" w:hAnsi="Times New Roman"/>
+                <w:b w:val="false"/>
+                <w:bCs w:val="false"/>
+                <w:sz w:val="22"/>
+                <w:szCs w:val="22"/>
+              </w:rPr>
+              <w:t>FAIL: IMU wiring, unresolved</w:t>
+            </w:r>
+          </w:p>
+        </w:tc>
+      </w:tr>
+    </w:tbl>
+    <w:p>
+      <w:pPr>
+        <w:spacing w:after="200" w:line="360"/>
+        <w:jc w:val="both"/>
+      </w:pPr>
+      <w:r>
+        <w:rPr>
+          <w:rFonts w:ascii="Times New Roman" w:cs="Times New Roman" w:eastAsia="Times New Roman" w:hAnsi="Times New Roman"/>
+          <w:b/>
+          <w:bCs/>
+          <w:sz w:val="24"/>
+          <w:szCs w:val="24"/>
+        </w:rPr>
+        <w:t xml:space="preserve">Result. </w:t>
+      </w:r>
+      <w:r>
+        <w:rPr>
+          <w:rFonts w:ascii="Times New Roman" w:cs="Times New Roman" w:eastAsia="Times New Roman" w:hAnsi="Times New Roman"/>
+          <w:sz w:val="24"/>
+          <w:szCs w:val="24"/>
+        </w:rPr>
+        <w:t xml:space="preserve">Both links reach the receiver's 50 Hz. The USB cable stays the default (one cable, and the receiver's own statistics reach the Pi); the UART wires remain the option. Neither glove has the planned rework yet; the assembler was sent the list of usable pins and fixes.</w:t>
+      </w:r>
+    </w:p>
+    <w:p>
+      <w:pPr>
+        <w:spacing w:after="200" w:line="360"/>
+        <w:jc w:val="both"/>
+      </w:pPr>
+      <w:r>
+        <w:rPr>
+          <w:rFonts w:ascii="Times New Roman" w:cs="Times New Roman" w:eastAsia="Times New Roman" w:hAnsi="Times New Roman"/>
+          <w:sz w:val="24"/>
+          <w:szCs w:val="24"/>
+        </w:rPr>
+        <w:t xml:space="preserve">Still not run anywhere:</w:t>
+      </w:r>
+    </w:p>
+    <w:p>
+      <w:pPr>
+        <w:pStyle w:val="ListParagraph"/>
+        <w:numPr>
+          <w:ilvl w:val="0"/>
+          <w:numId w:val="1"/>
+        </w:numPr>
+        <w:spacing w:after="100" w:line="360"/>
+        <w:jc w:val="both"/>
+      </w:pPr>
+      <w:r>
+        <w:rPr>
+          <w:rFonts w:ascii="Times New Roman" w:cs="Times New Roman" w:eastAsia="Times New Roman" w:hAnsi="Times New Roman"/>
+          <w:sz w:val="24"/>
+          <w:szCs w:val="24"/>
+        </w:rPr>
+        <w:t>Either link with gloves sending (received %, lost, fresh %), and runs longer than 10 s.</w:t>
+      </w:r>
+    </w:p>
+    <w:p>
+      <w:pPr>
+        <w:pStyle w:val="ListParagraph"/>
+        <w:numPr>
+          <w:ilvl w:val="0"/>
+          <w:numId w:val="1"/>
+        </w:numPr>
+        <w:spacing w:after="100" w:line="360"/>
+        <w:jc w:val="both"/>
+      </w:pPr>
+      <w:r>
+        <w:rPr>
+          <w:rFonts w:ascii="Times New Roman" w:cs="Times New Roman" w:eastAsia="Times New Roman" w:hAnsi="Times New Roman"/>
+          <w:sz w:val="24"/>
+          <w:szCs w:val="24"/>
+        </w:rPr>
+        <w:t>The glove firmware streaming, calibration, and the accelerometer reading about 1 g at rest.</w:t>
+      </w:r>
+    </w:p>
+    <w:p>
+      <w:pPr>
+        <w:pStyle w:val="ListParagraph"/>
+        <w:numPr>
+          <w:ilvl w:val="0"/>
+          <w:numId w:val="1"/>
+        </w:numPr>
+        <w:spacing w:after="100" w:line="360"/>
+        <w:jc w:val="both"/>
+      </w:pPr>
+      <w:r>
+        <w:rPr>
+          <w:rFonts w:ascii="Times New Roman" w:cs="Times New Roman" w:eastAsia="Times New Roman" w:hAnsi="Times New Roman"/>
+          <w:sz w:val="24"/>
+          <w:szCs w:val="24"/>
+        </w:rPr>
+        <w:t>Kiosk mode and autostart on the Pi with real data; recognition on real signing.</w:t>
       </w:r>
     </w:p>
     <w:p>

</xml_diff>